<commit_message>
added template variable for comments
</commit_message>
<xml_diff>
--- a/template/template_content_page.docx
+++ b/template/template_content_page.docx
@@ -1271,7 +1271,7 @@
                 <wp:positionV relativeFrom="paragraph">
                   <wp:posOffset>28575</wp:posOffset>
                 </wp:positionV>
-                <wp:extent cx="5972810" cy="2423795"/>
+                <wp:extent cx="5973445" cy="2424430"/>
                 <wp:effectExtent l="0" t="0" r="0" b="0"/>
                 <wp:wrapNone/>
                 <wp:docPr id="1" name="Forme2"/>
@@ -1282,7 +1282,7 @@
                       <wps:spPr>
                         <a:xfrm>
                           <a:off x="0" y="0"/>
-                          <a:ext cx="5972040" cy="2423160"/>
+                          <a:ext cx="5972760" cy="2423880"/>
                         </a:xfrm>
                         <a:prstGeom prst="rect">
                           <a:avLst/>
@@ -1309,7 +1309,7 @@
           </mc:Choice>
           <mc:Fallback>
             <w:pict>
-              <v:rect id="shape_0" ID="Forme2" stroked="t" style="position:absolute;margin-left:0pt;margin-top:2.25pt;width:470.2pt;height:190.75pt">
+              <v:rect id="shape_0" ID="Forme2" stroked="t" style="position:absolute;margin-left:0pt;margin-top:2.25pt;width:470.25pt;height:190.8pt">
                 <w10:wrap type="none"/>
                 <v:fill o:detectmouseclick="t" on="false"/>
                 <v:stroke color="black" joinstyle="round" endcap="flat"/>
@@ -1328,7 +1328,7 @@
                 <wp:positionV relativeFrom="paragraph">
                   <wp:posOffset>2577465</wp:posOffset>
                 </wp:positionV>
-                <wp:extent cx="7546975" cy="132715"/>
+                <wp:extent cx="7547610" cy="132715"/>
                 <wp:effectExtent l="0" t="0" r="0" b="0"/>
                 <wp:wrapNone/>
                 <wp:docPr id="2" name="Forme1"/>
@@ -1339,7 +1339,7 @@
                       <wps:spPr>
                         <a:xfrm>
                           <a:off x="0" y="0"/>
-                          <a:ext cx="7546320" cy="132120"/>
+                          <a:ext cx="7547040" cy="132120"/>
                         </a:xfrm>
                         <a:prstGeom prst="rect">
                           <a:avLst/>
@@ -1360,7 +1360,7 @@
                           <w:p>
                             <w:pPr>
                               <w:pStyle w:val="Contenudecadre"/>
-                              <w:overflowPunct w:val="true"/>
+                              <w:overflowPunct w:val="false"/>
                               <w:spacing w:lineRule="auto" w:line="240" w:before="0" w:after="0"/>
                               <w:jc w:val="center"/>
                               <w:rPr/>
@@ -1397,7 +1397,7 @@
           </mc:Choice>
           <mc:Fallback>
             <w:pict>
-              <v:rect id="shape_0" ID="Forme1" stroked="f" style="position:absolute;margin-left:-71.1pt;margin-top:202.95pt;width:594.15pt;height:10.35pt">
+              <v:rect id="shape_0" ID="Forme1" stroked="f" style="position:absolute;margin-left:-71.1pt;margin-top:202.95pt;width:594.2pt;height:10.35pt">
                 <w10:wrap type="square"/>
                 <v:fill o:detectmouseclick="t" on="false"/>
                 <v:stroke color="#3465a4" joinstyle="round" endcap="flat"/>
@@ -1406,7 +1406,7 @@
                     <w:p>
                       <w:pPr>
                         <w:pStyle w:val="Contenudecadre"/>
-                        <w:overflowPunct w:val="true"/>
+                        <w:overflowPunct w:val="false"/>
                         <w:spacing w:lineRule="auto" w:line="240" w:before="0" w:after="0"/>
                         <w:jc w:val="center"/>
                         <w:rPr/>
@@ -1436,8 +1436,6 @@
             </w:pict>
           </mc:Fallback>
         </mc:AlternateContent>
-      </w:r>
-      <w:r>
         <mc:AlternateContent>
           <mc:Choice Requires="wps">
             <w:drawing>
@@ -1449,27 +1447,39 @@
                 <wp:positionV relativeFrom="paragraph">
                   <wp:posOffset>28575</wp:posOffset>
                 </wp:positionV>
-                <wp:extent cx="5972810" cy="2649855"/>
+                <wp:extent cx="5973445" cy="2650490"/>
                 <wp:effectExtent l="0" t="0" r="0" b="0"/>
                 <wp:wrapNone/>
                 <wp:docPr id="4" name="Cadre1"/>
                 <a:graphic xmlns:a="http://schemas.openxmlformats.org/drawingml/2006/main">
                   <a:graphicData uri="http://schemas.microsoft.com/office/word/2010/wordprocessingShape">
                     <wps:wsp>
-                      <wps:cNvSpPr txBox="1"/>
+                      <wps:cNvSpPr/>
                       <wps:spPr>
                         <a:xfrm>
                           <a:off x="0" y="0"/>
-                          <a:ext cx="5972810" cy="2649855"/>
+                          <a:ext cx="5972760" cy="2649960"/>
                         </a:xfrm>
-                        <a:prstGeom prst="rect"/>
+                        <a:prstGeom prst="rect">
+                          <a:avLst/>
+                        </a:prstGeom>
+                        <a:noFill/>
+                        <a:ln>
+                          <a:noFill/>
+                        </a:ln>
                       </wps:spPr>
+                      <wps:style>
+                        <a:lnRef idx="0"/>
+                        <a:fillRef idx="0"/>
+                        <a:effectRef idx="0"/>
+                        <a:fontRef idx="minor"/>
+                      </wps:style>
                       <wps:txbx>
                         <w:txbxContent>
                           <w:p>
                             <w:pPr>
                               <w:pStyle w:val="Contenudecadre"/>
-                              <w:overflowPunct w:val="true"/>
+                              <w:overflowPunct w:val="false"/>
                               <w:spacing w:lineRule="auto" w:line="240" w:before="0" w:after="0"/>
                               <w:rPr>
                                 <w:sz w:val="20"/>
@@ -1502,7 +1512,34 @@
                           <w:p>
                             <w:pPr>
                               <w:pStyle w:val="Contenudecadre"/>
-                              <w:overflowPunct w:val="true"/>
+                              <w:overflowPunct w:val="false"/>
+                              <w:spacing w:lineRule="auto" w:line="240" w:before="0" w:after="0"/>
+                              <w:rPr>
+                                <w:rFonts w:ascii="Calibri" w:hAnsi="Calibri" w:eastAsia="Calibri" w:cs="" w:asciiTheme="minorHAnsi" w:cstheme="minorBidi" w:eastAsiaTheme="minorHAnsi" w:hAnsiTheme="minorHAnsi"/>
+                                <w:b w:val="false"/>
+                                <w:b w:val="false"/>
+                                <w:bCs w:val="false"/>
+                                <w:color w:val="auto"/>
+                                <w:sz w:val="20"/>
+                                <w:szCs w:val="20"/>
+                              </w:rPr>
+                            </w:pPr>
+                            <w:r>
+                              <w:rPr>
+                                <w:rFonts w:eastAsia="Calibri" w:cs="" w:cstheme="minorBidi" w:eastAsiaTheme="minorHAnsi"/>
+                                <w:b w:val="false"/>
+                                <w:bCs w:val="false"/>
+                                <w:color w:val="auto"/>
+                                <w:sz w:val="20"/>
+                                <w:szCs w:val="20"/>
+                              </w:rPr>
+                              <w:t>{{ code_comment }}</w:t>
+                            </w:r>
+                          </w:p>
+                          <w:p>
+                            <w:pPr>
+                              <w:pStyle w:val="Contenudecadre"/>
+                              <w:overflowPunct w:val="false"/>
                               <w:spacing w:lineRule="auto" w:line="240" w:before="0" w:after="0"/>
                               <w:rPr>
                                 <w:rFonts w:ascii="Calibri" w:hAnsi="Calibri" w:eastAsia="Calibri" w:cs="" w:asciiTheme="minorHAnsi" w:cstheme="minorBidi" w:eastAsiaTheme="minorHAnsi" w:hAnsiTheme="minorHAnsi"/>
@@ -1510,6 +1547,8 @@
                                 <w:b/>
                                 <w:bCs/>
                                 <w:color w:val="auto"/>
+                                <w:sz w:val="20"/>
+                                <w:szCs w:val="20"/>
                               </w:rPr>
                             </w:pPr>
                             <w:r>
@@ -1518,13 +1557,15 @@
                                 <w:b/>
                                 <w:bCs/>
                                 <w:color w:val="auto"/>
+                                <w:sz w:val="20"/>
+                                <w:szCs w:val="20"/>
                               </w:rPr>
                             </w:r>
                           </w:p>
                           <w:p>
                             <w:pPr>
                               <w:pStyle w:val="Contenudecadre"/>
-                              <w:overflowPunct w:val="true"/>
+                              <w:overflowPunct w:val="false"/>
                               <w:spacing w:lineRule="auto" w:line="240" w:before="0" w:after="0"/>
                               <w:rPr>
                                 <w:rFonts w:ascii="Calibri" w:hAnsi="Calibri" w:eastAsia="Calibri" w:cs="" w:asciiTheme="minorHAnsi" w:cstheme="minorBidi" w:eastAsiaTheme="minorHAnsi" w:hAnsiTheme="minorHAnsi"/>
@@ -1532,6 +1573,8 @@
                                 <w:b/>
                                 <w:bCs/>
                                 <w:color w:val="auto"/>
+                                <w:sz w:val="20"/>
+                                <w:szCs w:val="20"/>
                               </w:rPr>
                             </w:pPr>
                             <w:r>
@@ -1540,13 +1583,15 @@
                                 <w:b/>
                                 <w:bCs/>
                                 <w:color w:val="auto"/>
+                                <w:sz w:val="20"/>
+                                <w:szCs w:val="20"/>
                               </w:rPr>
                             </w:r>
                           </w:p>
                           <w:p>
                             <w:pPr>
                               <w:pStyle w:val="Contenudecadre"/>
-                              <w:overflowPunct w:val="true"/>
+                              <w:overflowPunct w:val="false"/>
                               <w:spacing w:lineRule="auto" w:line="240" w:before="0" w:after="0"/>
                               <w:rPr>
                                 <w:rFonts w:ascii="Calibri" w:hAnsi="Calibri" w:eastAsia="Calibri" w:cs="" w:asciiTheme="minorHAnsi" w:cstheme="minorBidi" w:eastAsiaTheme="minorHAnsi" w:hAnsiTheme="minorHAnsi"/>
@@ -1554,6 +1599,8 @@
                                 <w:b/>
                                 <w:bCs/>
                                 <w:color w:val="auto"/>
+                                <w:sz w:val="20"/>
+                                <w:szCs w:val="20"/>
                               </w:rPr>
                             </w:pPr>
                             <w:r>
@@ -1562,13 +1609,15 @@
                                 <w:b/>
                                 <w:bCs/>
                                 <w:color w:val="auto"/>
+                                <w:sz w:val="20"/>
+                                <w:szCs w:val="20"/>
                               </w:rPr>
                             </w:r>
                           </w:p>
                           <w:p>
                             <w:pPr>
                               <w:pStyle w:val="Contenudecadre"/>
-                              <w:overflowPunct w:val="true"/>
+                              <w:overflowPunct w:val="false"/>
                               <w:spacing w:lineRule="auto" w:line="240" w:before="0" w:after="0"/>
                               <w:rPr>
                                 <w:rFonts w:ascii="Calibri" w:hAnsi="Calibri" w:eastAsia="Calibri" w:cs="" w:asciiTheme="minorHAnsi" w:cstheme="minorBidi" w:eastAsiaTheme="minorHAnsi" w:hAnsiTheme="minorHAnsi"/>
@@ -1576,6 +1625,8 @@
                                 <w:b/>
                                 <w:bCs/>
                                 <w:color w:val="auto"/>
+                                <w:sz w:val="20"/>
+                                <w:szCs w:val="20"/>
                               </w:rPr>
                             </w:pPr>
                             <w:r>
@@ -1584,13 +1635,15 @@
                                 <w:b/>
                                 <w:bCs/>
                                 <w:color w:val="auto"/>
+                                <w:sz w:val="20"/>
+                                <w:szCs w:val="20"/>
                               </w:rPr>
                             </w:r>
                           </w:p>
                           <w:p>
                             <w:pPr>
                               <w:pStyle w:val="Contenudecadre"/>
-                              <w:overflowPunct w:val="true"/>
+                              <w:overflowPunct w:val="false"/>
                               <w:spacing w:lineRule="auto" w:line="240" w:before="0" w:after="0"/>
                               <w:rPr>
                                 <w:rFonts w:ascii="Calibri" w:hAnsi="Calibri" w:eastAsia="Calibri" w:cs="" w:asciiTheme="minorHAnsi" w:cstheme="minorBidi" w:eastAsiaTheme="minorHAnsi" w:hAnsiTheme="minorHAnsi"/>
@@ -1598,6 +1651,8 @@
                                 <w:b/>
                                 <w:bCs/>
                                 <w:color w:val="auto"/>
+                                <w:sz w:val="20"/>
+                                <w:szCs w:val="20"/>
                               </w:rPr>
                             </w:pPr>
                             <w:r>
@@ -1606,13 +1661,15 @@
                                 <w:b/>
                                 <w:bCs/>
                                 <w:color w:val="auto"/>
+                                <w:sz w:val="20"/>
+                                <w:szCs w:val="20"/>
                               </w:rPr>
                             </w:r>
                           </w:p>
                           <w:p>
                             <w:pPr>
                               <w:pStyle w:val="Contenudecadre"/>
-                              <w:overflowPunct w:val="true"/>
+                              <w:overflowPunct w:val="false"/>
                               <w:spacing w:lineRule="auto" w:line="240" w:before="0" w:after="0"/>
                               <w:rPr>
                                 <w:rFonts w:ascii="Calibri" w:hAnsi="Calibri" w:eastAsia="Calibri" w:cs="" w:asciiTheme="minorHAnsi" w:cstheme="minorBidi" w:eastAsiaTheme="minorHAnsi" w:hAnsiTheme="minorHAnsi"/>
@@ -1620,6 +1677,8 @@
                                 <w:b/>
                                 <w:bCs/>
                                 <w:color w:val="auto"/>
+                                <w:sz w:val="20"/>
+                                <w:szCs w:val="20"/>
                               </w:rPr>
                             </w:pPr>
                             <w:r>
@@ -1628,111 +1687,133 @@
                                 <w:b/>
                                 <w:bCs/>
                                 <w:color w:val="auto"/>
+                                <w:sz w:val="20"/>
+                                <w:szCs w:val="20"/>
                               </w:rPr>
                             </w:r>
                           </w:p>
                           <w:p>
                             <w:pPr>
                               <w:pStyle w:val="Contenudecadre"/>
-                              <w:overflowPunct w:val="true"/>
+                              <w:overflowPunct w:val="false"/>
                               <w:spacing w:lineRule="auto" w:line="240" w:before="0" w:after="0"/>
                               <w:rPr>
-                                <w:rFonts w:ascii="Calibri" w:hAnsi="Calibri" w:eastAsia="Calibri" w:cs="" w:asciiTheme="minorHAnsi" w:cstheme="minorBidi" w:eastAsiaTheme="minorHAnsi" w:hAnsiTheme="minorHAnsi"/>
-                                <w:b/>
-                                <w:b/>
-                                <w:bCs/>
-                                <w:color w:val="auto"/>
+                                <w:sz w:val="20"/>
+                                <w:szCs w:val="20"/>
                               </w:rPr>
                             </w:pPr>
                             <w:r>
                               <w:rPr>
-                                <w:rFonts w:eastAsia="Calibri" w:cs="" w:cstheme="minorBidi" w:eastAsiaTheme="minorHAnsi"/>
-                                <w:b/>
-                                <w:bCs/>
-                                <w:color w:val="auto"/>
+                                <w:sz w:val="20"/>
+                                <w:szCs w:val="20"/>
                               </w:rPr>
                             </w:r>
                           </w:p>
                           <w:p>
                             <w:pPr>
                               <w:pStyle w:val="Contenudecadre"/>
-                              <w:overflowPunct w:val="true"/>
+                              <w:overflowPunct w:val="false"/>
                               <w:spacing w:lineRule="auto" w:line="240" w:before="0" w:after="0"/>
-                              <w:rPr/>
+                              <w:rPr>
+                                <w:sz w:val="20"/>
+                                <w:szCs w:val="20"/>
+                              </w:rPr>
                             </w:pPr>
                             <w:r>
-                              <w:rPr/>
+                              <w:rPr>
+                                <w:sz w:val="20"/>
+                                <w:szCs w:val="20"/>
+                              </w:rPr>
                             </w:r>
                           </w:p>
                           <w:p>
                             <w:pPr>
                               <w:pStyle w:val="Contenudecadre"/>
-                              <w:overflowPunct w:val="true"/>
+                              <w:overflowPunct w:val="false"/>
                               <w:spacing w:lineRule="auto" w:line="240" w:before="0" w:after="0"/>
-                              <w:rPr/>
+                              <w:rPr>
+                                <w:sz w:val="20"/>
+                                <w:szCs w:val="20"/>
+                              </w:rPr>
                             </w:pPr>
                             <w:r>
-                              <w:rPr/>
+                              <w:rPr>
+                                <w:sz w:val="20"/>
+                                <w:szCs w:val="20"/>
+                              </w:rPr>
                             </w:r>
                           </w:p>
                           <w:p>
                             <w:pPr>
                               <w:pStyle w:val="Contenudecadre"/>
-                              <w:overflowPunct w:val="true"/>
+                              <w:overflowPunct w:val="false"/>
                               <w:spacing w:lineRule="auto" w:line="240" w:before="0" w:after="0"/>
-                              <w:rPr/>
+                              <w:rPr>
+                                <w:sz w:val="20"/>
+                                <w:szCs w:val="20"/>
+                              </w:rPr>
                             </w:pPr>
                             <w:r>
-                              <w:rPr/>
+                              <w:rPr>
+                                <w:sz w:val="20"/>
+                                <w:szCs w:val="20"/>
+                              </w:rPr>
                             </w:r>
                           </w:p>
                           <w:p>
                             <w:pPr>
                               <w:pStyle w:val="Contenudecadre"/>
-                              <w:overflowPunct w:val="true"/>
+                              <w:overflowPunct w:val="false"/>
                               <w:spacing w:lineRule="auto" w:line="240" w:before="0" w:after="0"/>
-                              <w:rPr/>
+                              <w:rPr>
+                                <w:sz w:val="20"/>
+                                <w:szCs w:val="20"/>
+                              </w:rPr>
                             </w:pPr>
                             <w:r>
-                              <w:rPr/>
+                              <w:rPr>
+                                <w:sz w:val="20"/>
+                                <w:szCs w:val="20"/>
+                              </w:rPr>
                             </w:r>
                           </w:p>
                           <w:p>
                             <w:pPr>
                               <w:pStyle w:val="Contenudecadre"/>
-                              <w:overflowPunct w:val="true"/>
+                              <w:overflowPunct w:val="false"/>
                               <w:spacing w:lineRule="auto" w:line="240" w:before="0" w:after="0"/>
-                              <w:rPr/>
+                              <w:rPr>
+                                <w:sz w:val="20"/>
+                                <w:szCs w:val="20"/>
+                              </w:rPr>
                             </w:pPr>
                             <w:r>
-                              <w:rPr/>
+                              <w:rPr>
+                                <w:sz w:val="20"/>
+                                <w:szCs w:val="20"/>
+                              </w:rPr>
                             </w:r>
                           </w:p>
                           <w:p>
                             <w:pPr>
                               <w:pStyle w:val="Contenudecadre"/>
-                              <w:overflowPunct w:val="true"/>
+                              <w:overflowPunct w:val="false"/>
                               <w:spacing w:lineRule="auto" w:line="240" w:before="0" w:after="0"/>
-                              <w:rPr/>
+                              <w:rPr>
+                                <w:sz w:val="20"/>
+                                <w:szCs w:val="20"/>
+                              </w:rPr>
                             </w:pPr>
                             <w:r>
-                              <w:rPr/>
-                            </w:r>
-                          </w:p>
-                          <w:p>
-                            <w:pPr>
-                              <w:pStyle w:val="Contenudecadre"/>
-                              <w:overflowPunct w:val="true"/>
-                              <w:spacing w:lineRule="auto" w:line="240" w:before="0" w:after="0"/>
-                              <w:rPr/>
-                            </w:pPr>
-                            <w:r>
-                              <w:rPr/>
+                              <w:rPr>
+                                <w:sz w:val="20"/>
+                                <w:szCs w:val="20"/>
+                              </w:rPr>
                             </w:r>
                           </w:p>
                         </w:txbxContent>
                       </wps:txbx>
-                      <wps:bodyPr anchor="t" lIns="0" tIns="0" rIns="0" bIns="0">
+                      <wps:bodyPr lIns="0" rIns="0" tIns="0" bIns="0">
                         <a:noAutofit/>
                       </wps:bodyPr>
                     </wps:wsp>
@@ -1743,13 +1824,16 @@
           </mc:Choice>
           <mc:Fallback>
             <w:pict>
-              <v:rect style="position:absolute;rotation:0;width:470.3pt;height:208.65pt;mso-wrap-distance-left:5.7pt;mso-wrap-distance-right:5.7pt;mso-wrap-distance-top:5.7pt;mso-wrap-distance-bottom:5.7pt;margin-top:2.25pt;mso-position-vertical-relative:text;margin-left:0pt;mso-position-horizontal-relative:text">
-                <v:textbox inset="0in,0in,0in,0in">
+              <v:rect id="shape_0" ID="Cadre1" stroked="f" style="position:absolute;margin-left:0pt;margin-top:2.25pt;width:470.25pt;height:208.6pt">
+                <w10:wrap type="square"/>
+                <v:fill o:detectmouseclick="t" on="false"/>
+                <v:stroke color="#3465a4" joinstyle="round" endcap="flat"/>
+                <v:textbox>
                   <w:txbxContent>
                     <w:p>
                       <w:pPr>
                         <w:pStyle w:val="Contenudecadre"/>
-                        <w:overflowPunct w:val="true"/>
+                        <w:overflowPunct w:val="false"/>
                         <w:spacing w:lineRule="auto" w:line="240" w:before="0" w:after="0"/>
                         <w:rPr>
                           <w:sz w:val="20"/>
@@ -1782,7 +1866,34 @@
                     <w:p>
                       <w:pPr>
                         <w:pStyle w:val="Contenudecadre"/>
-                        <w:overflowPunct w:val="true"/>
+                        <w:overflowPunct w:val="false"/>
+                        <w:spacing w:lineRule="auto" w:line="240" w:before="0" w:after="0"/>
+                        <w:rPr>
+                          <w:rFonts w:ascii="Calibri" w:hAnsi="Calibri" w:eastAsia="Calibri" w:cs="" w:asciiTheme="minorHAnsi" w:cstheme="minorBidi" w:eastAsiaTheme="minorHAnsi" w:hAnsiTheme="minorHAnsi"/>
+                          <w:b w:val="false"/>
+                          <w:b w:val="false"/>
+                          <w:bCs w:val="false"/>
+                          <w:color w:val="auto"/>
+                          <w:sz w:val="20"/>
+                          <w:szCs w:val="20"/>
+                        </w:rPr>
+                      </w:pPr>
+                      <w:r>
+                        <w:rPr>
+                          <w:rFonts w:eastAsia="Calibri" w:cs="" w:cstheme="minorBidi" w:eastAsiaTheme="minorHAnsi"/>
+                          <w:b w:val="false"/>
+                          <w:bCs w:val="false"/>
+                          <w:color w:val="auto"/>
+                          <w:sz w:val="20"/>
+                          <w:szCs w:val="20"/>
+                        </w:rPr>
+                        <w:t>{{ code_comment }}</w:t>
+                      </w:r>
+                    </w:p>
+                    <w:p>
+                      <w:pPr>
+                        <w:pStyle w:val="Contenudecadre"/>
+                        <w:overflowPunct w:val="false"/>
                         <w:spacing w:lineRule="auto" w:line="240" w:before="0" w:after="0"/>
                         <w:rPr>
                           <w:rFonts w:ascii="Calibri" w:hAnsi="Calibri" w:eastAsia="Calibri" w:cs="" w:asciiTheme="minorHAnsi" w:cstheme="minorBidi" w:eastAsiaTheme="minorHAnsi" w:hAnsiTheme="minorHAnsi"/>
@@ -1790,6 +1901,8 @@
                           <w:b/>
                           <w:bCs/>
                           <w:color w:val="auto"/>
+                          <w:sz w:val="20"/>
+                          <w:szCs w:val="20"/>
                         </w:rPr>
                       </w:pPr>
                       <w:r>
@@ -1798,13 +1911,15 @@
                           <w:b/>
                           <w:bCs/>
                           <w:color w:val="auto"/>
+                          <w:sz w:val="20"/>
+                          <w:szCs w:val="20"/>
                         </w:rPr>
                       </w:r>
                     </w:p>
                     <w:p>
                       <w:pPr>
                         <w:pStyle w:val="Contenudecadre"/>
-                        <w:overflowPunct w:val="true"/>
+                        <w:overflowPunct w:val="false"/>
                         <w:spacing w:lineRule="auto" w:line="240" w:before="0" w:after="0"/>
                         <w:rPr>
                           <w:rFonts w:ascii="Calibri" w:hAnsi="Calibri" w:eastAsia="Calibri" w:cs="" w:asciiTheme="minorHAnsi" w:cstheme="minorBidi" w:eastAsiaTheme="minorHAnsi" w:hAnsiTheme="minorHAnsi"/>
@@ -1812,6 +1927,8 @@
                           <w:b/>
                           <w:bCs/>
                           <w:color w:val="auto"/>
+                          <w:sz w:val="20"/>
+                          <w:szCs w:val="20"/>
                         </w:rPr>
                       </w:pPr>
                       <w:r>
@@ -1820,13 +1937,15 @@
                           <w:b/>
                           <w:bCs/>
                           <w:color w:val="auto"/>
+                          <w:sz w:val="20"/>
+                          <w:szCs w:val="20"/>
                         </w:rPr>
                       </w:r>
                     </w:p>
                     <w:p>
                       <w:pPr>
                         <w:pStyle w:val="Contenudecadre"/>
-                        <w:overflowPunct w:val="true"/>
+                        <w:overflowPunct w:val="false"/>
                         <w:spacing w:lineRule="auto" w:line="240" w:before="0" w:after="0"/>
                         <w:rPr>
                           <w:rFonts w:ascii="Calibri" w:hAnsi="Calibri" w:eastAsia="Calibri" w:cs="" w:asciiTheme="minorHAnsi" w:cstheme="minorBidi" w:eastAsiaTheme="minorHAnsi" w:hAnsiTheme="minorHAnsi"/>
@@ -1834,6 +1953,8 @@
                           <w:b/>
                           <w:bCs/>
                           <w:color w:val="auto"/>
+                          <w:sz w:val="20"/>
+                          <w:szCs w:val="20"/>
                         </w:rPr>
                       </w:pPr>
                       <w:r>
@@ -1842,13 +1963,15 @@
                           <w:b/>
                           <w:bCs/>
                           <w:color w:val="auto"/>
+                          <w:sz w:val="20"/>
+                          <w:szCs w:val="20"/>
                         </w:rPr>
                       </w:r>
                     </w:p>
                     <w:p>
                       <w:pPr>
                         <w:pStyle w:val="Contenudecadre"/>
-                        <w:overflowPunct w:val="true"/>
+                        <w:overflowPunct w:val="false"/>
                         <w:spacing w:lineRule="auto" w:line="240" w:before="0" w:after="0"/>
                         <w:rPr>
                           <w:rFonts w:ascii="Calibri" w:hAnsi="Calibri" w:eastAsia="Calibri" w:cs="" w:asciiTheme="minorHAnsi" w:cstheme="minorBidi" w:eastAsiaTheme="minorHAnsi" w:hAnsiTheme="minorHAnsi"/>
@@ -1856,6 +1979,8 @@
                           <w:b/>
                           <w:bCs/>
                           <w:color w:val="auto"/>
+                          <w:sz w:val="20"/>
+                          <w:szCs w:val="20"/>
                         </w:rPr>
                       </w:pPr>
                       <w:r>
@@ -1864,13 +1989,15 @@
                           <w:b/>
                           <w:bCs/>
                           <w:color w:val="auto"/>
+                          <w:sz w:val="20"/>
+                          <w:szCs w:val="20"/>
                         </w:rPr>
                       </w:r>
                     </w:p>
                     <w:p>
                       <w:pPr>
                         <w:pStyle w:val="Contenudecadre"/>
-                        <w:overflowPunct w:val="true"/>
+                        <w:overflowPunct w:val="false"/>
                         <w:spacing w:lineRule="auto" w:line="240" w:before="0" w:after="0"/>
                         <w:rPr>
                           <w:rFonts w:ascii="Calibri" w:hAnsi="Calibri" w:eastAsia="Calibri" w:cs="" w:asciiTheme="minorHAnsi" w:cstheme="minorBidi" w:eastAsiaTheme="minorHAnsi" w:hAnsiTheme="minorHAnsi"/>
@@ -1878,6 +2005,8 @@
                           <w:b/>
                           <w:bCs/>
                           <w:color w:val="auto"/>
+                          <w:sz w:val="20"/>
+                          <w:szCs w:val="20"/>
                         </w:rPr>
                       </w:pPr>
                       <w:r>
@@ -1886,13 +2015,15 @@
                           <w:b/>
                           <w:bCs/>
                           <w:color w:val="auto"/>
+                          <w:sz w:val="20"/>
+                          <w:szCs w:val="20"/>
                         </w:rPr>
                       </w:r>
                     </w:p>
                     <w:p>
                       <w:pPr>
                         <w:pStyle w:val="Contenudecadre"/>
-                        <w:overflowPunct w:val="true"/>
+                        <w:overflowPunct w:val="false"/>
                         <w:spacing w:lineRule="auto" w:line="240" w:before="0" w:after="0"/>
                         <w:rPr>
                           <w:rFonts w:ascii="Calibri" w:hAnsi="Calibri" w:eastAsia="Calibri" w:cs="" w:asciiTheme="minorHAnsi" w:cstheme="minorBidi" w:eastAsiaTheme="minorHAnsi" w:hAnsiTheme="minorHAnsi"/>
@@ -1900,6 +2031,8 @@
                           <w:b/>
                           <w:bCs/>
                           <w:color w:val="auto"/>
+                          <w:sz w:val="20"/>
+                          <w:szCs w:val="20"/>
                         </w:rPr>
                       </w:pPr>
                       <w:r>
@@ -1908,106 +2041,128 @@
                           <w:b/>
                           <w:bCs/>
                           <w:color w:val="auto"/>
+                          <w:sz w:val="20"/>
+                          <w:szCs w:val="20"/>
                         </w:rPr>
                       </w:r>
                     </w:p>
                     <w:p>
                       <w:pPr>
                         <w:pStyle w:val="Contenudecadre"/>
-                        <w:overflowPunct w:val="true"/>
+                        <w:overflowPunct w:val="false"/>
                         <w:spacing w:lineRule="auto" w:line="240" w:before="0" w:after="0"/>
                         <w:rPr>
-                          <w:rFonts w:ascii="Calibri" w:hAnsi="Calibri" w:eastAsia="Calibri" w:cs="" w:asciiTheme="minorHAnsi" w:cstheme="minorBidi" w:eastAsiaTheme="minorHAnsi" w:hAnsiTheme="minorHAnsi"/>
-                          <w:b/>
-                          <w:b/>
-                          <w:bCs/>
-                          <w:color w:val="auto"/>
+                          <w:sz w:val="20"/>
+                          <w:szCs w:val="20"/>
                         </w:rPr>
                       </w:pPr>
                       <w:r>
                         <w:rPr>
-                          <w:rFonts w:eastAsia="Calibri" w:cs="" w:cstheme="minorBidi" w:eastAsiaTheme="minorHAnsi"/>
-                          <w:b/>
-                          <w:bCs/>
-                          <w:color w:val="auto"/>
+                          <w:sz w:val="20"/>
+                          <w:szCs w:val="20"/>
                         </w:rPr>
                       </w:r>
                     </w:p>
                     <w:p>
                       <w:pPr>
                         <w:pStyle w:val="Contenudecadre"/>
-                        <w:overflowPunct w:val="true"/>
+                        <w:overflowPunct w:val="false"/>
                         <w:spacing w:lineRule="auto" w:line="240" w:before="0" w:after="0"/>
-                        <w:rPr/>
+                        <w:rPr>
+                          <w:sz w:val="20"/>
+                          <w:szCs w:val="20"/>
+                        </w:rPr>
                       </w:pPr>
                       <w:r>
-                        <w:rPr/>
+                        <w:rPr>
+                          <w:sz w:val="20"/>
+                          <w:szCs w:val="20"/>
+                        </w:rPr>
                       </w:r>
                     </w:p>
                     <w:p>
                       <w:pPr>
                         <w:pStyle w:val="Contenudecadre"/>
-                        <w:overflowPunct w:val="true"/>
+                        <w:overflowPunct w:val="false"/>
                         <w:spacing w:lineRule="auto" w:line="240" w:before="0" w:after="0"/>
-                        <w:rPr/>
+                        <w:rPr>
+                          <w:sz w:val="20"/>
+                          <w:szCs w:val="20"/>
+                        </w:rPr>
                       </w:pPr>
                       <w:r>
-                        <w:rPr/>
+                        <w:rPr>
+                          <w:sz w:val="20"/>
+                          <w:szCs w:val="20"/>
+                        </w:rPr>
                       </w:r>
                     </w:p>
                     <w:p>
                       <w:pPr>
                         <w:pStyle w:val="Contenudecadre"/>
-                        <w:overflowPunct w:val="true"/>
+                        <w:overflowPunct w:val="false"/>
                         <w:spacing w:lineRule="auto" w:line="240" w:before="0" w:after="0"/>
-                        <w:rPr/>
+                        <w:rPr>
+                          <w:sz w:val="20"/>
+                          <w:szCs w:val="20"/>
+                        </w:rPr>
                       </w:pPr>
                       <w:r>
-                        <w:rPr/>
+                        <w:rPr>
+                          <w:sz w:val="20"/>
+                          <w:szCs w:val="20"/>
+                        </w:rPr>
                       </w:r>
                     </w:p>
                     <w:p>
                       <w:pPr>
                         <w:pStyle w:val="Contenudecadre"/>
-                        <w:overflowPunct w:val="true"/>
+                        <w:overflowPunct w:val="false"/>
                         <w:spacing w:lineRule="auto" w:line="240" w:before="0" w:after="0"/>
-                        <w:rPr/>
+                        <w:rPr>
+                          <w:sz w:val="20"/>
+                          <w:szCs w:val="20"/>
+                        </w:rPr>
                       </w:pPr>
                       <w:r>
-                        <w:rPr/>
+                        <w:rPr>
+                          <w:sz w:val="20"/>
+                          <w:szCs w:val="20"/>
+                        </w:rPr>
                       </w:r>
                     </w:p>
                     <w:p>
                       <w:pPr>
                         <w:pStyle w:val="Contenudecadre"/>
-                        <w:overflowPunct w:val="true"/>
+                        <w:overflowPunct w:val="false"/>
                         <w:spacing w:lineRule="auto" w:line="240" w:before="0" w:after="0"/>
-                        <w:rPr/>
+                        <w:rPr>
+                          <w:sz w:val="20"/>
+                          <w:szCs w:val="20"/>
+                        </w:rPr>
                       </w:pPr>
                       <w:r>
-                        <w:rPr/>
+                        <w:rPr>
+                          <w:sz w:val="20"/>
+                          <w:szCs w:val="20"/>
+                        </w:rPr>
                       </w:r>
                     </w:p>
                     <w:p>
                       <w:pPr>
                         <w:pStyle w:val="Contenudecadre"/>
-                        <w:overflowPunct w:val="true"/>
+                        <w:overflowPunct w:val="false"/>
                         <w:spacing w:lineRule="auto" w:line="240" w:before="0" w:after="0"/>
-                        <w:rPr/>
+                        <w:rPr>
+                          <w:sz w:val="20"/>
+                          <w:szCs w:val="20"/>
+                        </w:rPr>
                       </w:pPr>
                       <w:r>
-                        <w:rPr/>
-                      </w:r>
-                    </w:p>
-                    <w:p>
-                      <w:pPr>
-                        <w:pStyle w:val="Contenudecadre"/>
-                        <w:overflowPunct w:val="true"/>
-                        <w:spacing w:lineRule="auto" w:line="240" w:before="0" w:after="0"/>
-                        <w:rPr/>
-                      </w:pPr>
-                      <w:r>
-                        <w:rPr/>
+                        <w:rPr>
+                          <w:sz w:val="20"/>
+                          <w:szCs w:val="20"/>
+                        </w:rPr>
                       </w:r>
                     </w:p>
                   </w:txbxContent>
@@ -2044,18 +2199,18 @@
       <mc:AlternateContent>
         <mc:Choice Requires="wps">
           <w:drawing>
-            <wp:anchor behindDoc="1" distT="0" distB="0" distL="114300" distR="49530" simplePos="0" locked="0" layoutInCell="1" allowOverlap="1" relativeHeight="7">
+            <wp:anchor behindDoc="1" distT="0" distB="0" distL="114300" distR="49530" simplePos="0" locked="0" layoutInCell="1" allowOverlap="1" relativeHeight="6">
               <wp:simplePos x="0" y="0"/>
               <wp:positionH relativeFrom="column">
                 <wp:posOffset>4748530</wp:posOffset>
               </wp:positionH>
               <wp:positionV relativeFrom="paragraph">
-                <wp:posOffset>-332740</wp:posOffset>
+                <wp:posOffset>-332105</wp:posOffset>
               </wp:positionV>
-              <wp:extent cx="1612265" cy="1078865"/>
+              <wp:extent cx="1612900" cy="1079500"/>
               <wp:effectExtent l="0" t="0" r="64770" b="64770"/>
               <wp:wrapSquare wrapText="bothSides"/>
-              <wp:docPr id="5" name="Image 2"/>
+              <wp:docPr id="6" name="Image 2"/>
               <a:graphic xmlns:a="http://schemas.openxmlformats.org/drawingml/2006/main">
                 <a:graphicData uri="http://schemas.openxmlformats.org/drawingml/2006/picture">
                   <pic:pic xmlns:pic="http://schemas.openxmlformats.org/drawingml/2006/picture">
@@ -2071,7 +2226,7 @@
                     <pic:spPr>
                       <a:xfrm>
                         <a:off x="0" y="0"/>
-                        <a:ext cx="1611720" cy="1078200"/>
+                        <a:ext cx="1612440" cy="1078920"/>
                       </a:xfrm>
                       <a:prstGeom prst="rect">
                         <a:avLst/>
@@ -2112,7 +2267,7 @@
               <v:path o:extrusionok="f" gradientshapeok="t" o:connecttype="rect"/>
               <o:lock v:ext="edit" aspectratio="t"/>
             </v:shapetype>
-            <v:shape id="shape_0" ID="Image 2" stroked="f" style="position:absolute;margin-left:373.9pt;margin-top:-26.2pt;width:126.85pt;height:84.85pt" type="shapetype_75">
+            <v:shape id="shape_0" ID="Image 2" stroked="f" style="position:absolute;margin-left:373.9pt;margin-top:-26.15pt;width:126.9pt;height:84.9pt" type="shapetype_75">
               <v:imagedata r:id="rId1" o:detectmouseclick="t"/>
               <w10:wrap type="none"/>
               <v:stroke color="#3465a4" joinstyle="round" endcap="flat"/>
@@ -2121,7 +2276,7 @@
         </mc:Fallback>
       </mc:AlternateContent>
       <w:drawing>
-        <wp:anchor behindDoc="1" distT="0" distB="9525" distL="114300" distR="114300" simplePos="0" locked="0" layoutInCell="1" allowOverlap="1" relativeHeight="6">
+        <wp:anchor behindDoc="1" distT="0" distB="9525" distL="114300" distR="114300" simplePos="0" locked="0" layoutInCell="1" allowOverlap="1" relativeHeight="5">
           <wp:simplePos x="0" y="0"/>
           <wp:positionH relativeFrom="column">
             <wp:posOffset>-385445</wp:posOffset>
@@ -2132,7 +2287,7 @@
           <wp:extent cx="1087120" cy="981075"/>
           <wp:effectExtent l="0" t="0" r="0" b="0"/>
           <wp:wrapSquare wrapText="bothSides"/>
-          <wp:docPr id="6" name="Image2" descr=""/>
+          <wp:docPr id="7" name="Image2" descr=""/>
           <wp:cNvGraphicFramePr>
             <a:graphicFrameLocks xmlns:a="http://schemas.openxmlformats.org/drawingml/2006/main" noChangeAspect="1"/>
           </wp:cNvGraphicFramePr>
@@ -2140,7 +2295,7 @@
             <a:graphicData uri="http://schemas.openxmlformats.org/drawingml/2006/picture">
               <pic:pic xmlns:pic="http://schemas.openxmlformats.org/drawingml/2006/picture">
                 <pic:nvPicPr>
-                  <pic:cNvPr id="6" name="Image2" descr=""/>
+                  <pic:cNvPr id="7" name="Image2" descr=""/>
                   <pic:cNvPicPr>
                     <a:picLocks noChangeAspect="1" noChangeArrowheads="1"/>
                   </pic:cNvPicPr>

</xml_diff>

<commit_message>
generated templates for transposition
</commit_message>
<xml_diff>
--- a/template/template_content_page.docx
+++ b/template/template_content_page.docx
@@ -4,18 +4,60 @@
   <w:body>
     <w:p>
       <w:pPr>
-        <w:pStyle w:val="Normal"/>
+        <w:pStyle w:val="Corpsdetexte"/>
+        <w:spacing w:lineRule="atLeast" w:line="256"/>
         <w:jc w:val="center"/>
         <w:rPr/>
       </w:pPr>
       <w:r>
         <w:rPr>
-          <w:rFonts w:cs="Arial" w:ascii="Arial" w:hAnsi="Arial"/>
+          <w:rFonts w:ascii="Liberation Sans" w:hAnsi="Liberation Sans"/>
           <w:b/>
           <w:bCs/>
           <w:sz w:val="28"/>
           <w:szCs w:val="28"/>
         </w:rPr>
+        <w:t>{{ indicateur_top }}</w:t>
+      </w:r>
+    </w:p>
+    <w:p>
+      <w:pPr>
+        <w:pStyle w:val="Corpsdetexte"/>
+        <w:spacing w:lineRule="auto" w:line="120"/>
+        <w:jc w:val="center"/>
+        <w:rPr>
+          <w:rFonts w:ascii="Liberation Sans" w:hAnsi="Liberation Sans"/>
+          <w:b/>
+          <w:b/>
+          <w:bCs/>
+          <w:sz w:val="28"/>
+          <w:szCs w:val="28"/>
+        </w:rPr>
+      </w:pPr>
+      <w:r>
+        <w:rPr>
+          <w:rFonts w:ascii="Liberation Sans" w:hAnsi="Liberation Sans"/>
+          <w:b/>
+          <w:bCs/>
+          <w:sz w:val="28"/>
+          <w:szCs w:val="28"/>
+        </w:rPr>
+        <w:t xml:space="preserve">pour la mesure </w:t>
+      </w:r>
+    </w:p>
+    <w:p>
+      <w:pPr>
+        <w:pStyle w:val="Titre3"/>
+        <w:numPr>
+          <w:ilvl w:val="2"/>
+          <w:numId w:val="2"/>
+        </w:numPr>
+        <w:spacing w:lineRule="auto" w:line="144"/>
+        <w:jc w:val="center"/>
+        <w:rPr/>
+      </w:pPr>
+      <w:r>
+        <w:rPr/>
         <w:t>{{ mesure }}</w:t>
       </w:r>
     </w:p>
@@ -54,14 +96,14 @@
           <w:sz w:val="20"/>
           <w:szCs w:val="20"/>
         </w:rPr>
-        <w:t>{{ date }}, {{ indicateur }} : {{ val }}</w:t>
+        <w:t>{{ date }}, {{ indicateur }} : {{ val }}</w:t>
       </w:r>
     </w:p>
     <w:tbl>
       <w:tblPr>
         <w:tblStyle w:val="Grilledutableau"/>
         <w:tblW w:w="9417" w:type="dxa"/>
-        <w:jc w:val="left"/>
+        <w:jc w:val="center"/>
         <w:tblInd w:w="0" w:type="dxa"/>
         <w:tblCellMar>
           <w:top w:w="0" w:type="dxa"/>
@@ -86,16 +128,14 @@
             <w:gridSpan w:val="3"/>
             <w:tcBorders/>
             <w:shd w:fill="auto" w:val="clear"/>
+            <w:vAlign w:val="center"/>
           </w:tcPr>
           <w:p>
             <w:pPr>
               <w:pStyle w:val="Obsahtabulky"/>
               <w:spacing w:lineRule="auto" w:line="240" w:before="0" w:after="0"/>
               <w:jc w:val="center"/>
-              <w:rPr>
-                <w:sz w:val="20"/>
-                <w:szCs w:val="20"/>
-              </w:rPr>
+              <w:rPr/>
             </w:pPr>
             <w:r>
               <w:rPr>
@@ -111,7 +151,7 @@
                 <w:sz w:val="20"/>
                 <w:szCs w:val="20"/>
               </w:rPr>
-              <w:t>{{ title_table_nat }}</w:t>
+              <w:t>{{ title_table_dep }}  : {{ lib_dep }}</w:t>
             </w:r>
           </w:p>
         </w:tc>
@@ -127,16 +167,14 @@
               <w:top w:val="nil"/>
             </w:tcBorders>
             <w:shd w:fill="auto" w:val="clear"/>
+            <w:vAlign w:val="center"/>
           </w:tcPr>
           <w:p>
             <w:pPr>
               <w:pStyle w:val="Normal"/>
               <w:spacing w:lineRule="auto" w:line="240" w:before="0" w:after="0"/>
               <w:jc w:val="center"/>
-              <w:rPr>
-                <w:sz w:val="20"/>
-                <w:szCs w:val="20"/>
-              </w:rPr>
+              <w:rPr/>
             </w:pPr>
             <w:r>
               <w:rPr>
@@ -155,43 +193,23 @@
               <w:top w:val="nil"/>
             </w:tcBorders>
             <w:shd w:fill="auto" w:val="clear"/>
+            <w:vAlign w:val="center"/>
           </w:tcPr>
           <w:p>
             <w:pPr>
               <w:pStyle w:val="Normal"/>
               <w:spacing w:lineRule="auto" w:line="240" w:before="0" w:after="0"/>
               <w:jc w:val="center"/>
-              <w:rPr>
-                <w:sz w:val="20"/>
-                <w:szCs w:val="20"/>
-              </w:rPr>
-            </w:pPr>
-            <w:r>
-              <w:rPr>
-                <w:rFonts w:cs="Arial" w:ascii="Arial" w:hAnsi="Arial"/>
-                <w:sz w:val="20"/>
-                <w:szCs w:val="20"/>
-              </w:rPr>
-              <w:t xml:space="preserve">    </w:t>
-            </w:r>
-            <w:r>
-              <w:rPr>
-                <w:rFonts w:cs="Arial" w:ascii="Arial" w:hAnsi="Arial"/>
-                <w:sz w:val="20"/>
-                <w:szCs w:val="20"/>
-              </w:rPr>
-              <w:t xml:space="preserve">{% cellbg  404079 %}     </w:t>
-            </w:r>
-          </w:p>
-          <w:p>
-            <w:pPr>
-              <w:pStyle w:val="Normal"/>
-              <w:spacing w:lineRule="auto" w:line="240" w:before="0" w:after="0"/>
-              <w:jc w:val="center"/>
-              <w:rPr>
-                <w:color w:val="FFFFFF"/>
-              </w:rPr>
-            </w:pPr>
+              <w:rPr/>
+            </w:pPr>
+            <w:r>
+              <w:rPr>
+                <w:rFonts w:cs="Arial" w:ascii="Arial" w:hAnsi="Arial"/>
+                <w:sz w:val="20"/>
+                <w:szCs w:val="20"/>
+              </w:rPr>
+              <w:t>{% cellbg  404079 %}</w:t>
+            </w:r>
             <w:r>
               <w:rPr>
                 <w:rFonts w:cs="Arial" w:ascii="Arial" w:hAnsi="Arial"/>
@@ -212,6 +230,7 @@
               <w:top w:val="nil"/>
             </w:tcBorders>
             <w:shd w:fill="auto" w:val="clear"/>
+            <w:vAlign w:val="center"/>
           </w:tcPr>
           <w:p>
             <w:pPr>
@@ -244,24 +263,22 @@
             <w:gridSpan w:val="3"/>
             <w:tcBorders/>
             <w:shd w:fill="auto" w:val="clear"/>
+            <w:vAlign w:val="center"/>
           </w:tcPr>
           <w:p>
             <w:pPr>
               <w:pStyle w:val="Texteprformat"/>
               <w:spacing w:lineRule="auto" w:line="240" w:before="0" w:after="0"/>
               <w:jc w:val="center"/>
-              <w:rPr>
-                <w:sz w:val="20"/>
-                <w:szCs w:val="20"/>
-              </w:rPr>
-            </w:pPr>
-            <w:r>
-              <w:rPr>
-                <w:rFonts w:cs="Arial" w:ascii="Arial" w:hAnsi="Arial"/>
-                <w:sz w:val="20"/>
-                <w:szCs w:val="20"/>
-              </w:rPr>
-              <w:t>{%tr for item in tbl_contents_nat %}</w:t>
+              <w:rPr/>
+            </w:pPr>
+            <w:r>
+              <w:rPr>
+                <w:rFonts w:cs="Arial" w:ascii="Arial" w:hAnsi="Arial"/>
+                <w:sz w:val="20"/>
+                <w:szCs w:val="20"/>
+              </w:rPr>
+              <w:t>{%tr for item in tbl_contents_dep %}</w:t>
             </w:r>
           </w:p>
         </w:tc>
@@ -275,6 +292,7 @@
             <w:tcW w:w="2600" w:type="dxa"/>
             <w:tcBorders/>
             <w:shd w:fill="auto" w:val="clear"/>
+            <w:vAlign w:val="center"/>
           </w:tcPr>
           <w:p>
             <w:pPr>
@@ -322,6 +340,7 @@
             <w:tcW w:w="4432" w:type="dxa"/>
             <w:tcBorders/>
             <w:shd w:fill="auto" w:val="clear"/>
+            <w:vAlign w:val="center"/>
           </w:tcPr>
           <w:p>
             <w:pPr>
@@ -337,7 +356,7 @@
                 <w:sz w:val="20"/>
                 <w:szCs w:val="20"/>
               </w:rPr>
-              <w:t>{% cellbg    loop.cycle(‘FFFFFF’, ‘BDBDBD’)</w:t>
+              <w:t>{% cellbg loop.cycle(‘FFFFFF’, ‘BDBDBD’)</w:t>
             </w:r>
           </w:p>
           <w:p>
@@ -365,17 +384,6 @@
               </w:rPr>
               <w:t>%}</w:t>
             </w:r>
-          </w:p>
-          <w:p>
-            <w:pPr>
-              <w:pStyle w:val="Normal"/>
-              <w:spacing w:lineRule="auto" w:line="240" w:before="0" w:after="0"/>
-              <w:jc w:val="center"/>
-              <w:rPr>
-                <w:sz w:val="20"/>
-                <w:szCs w:val="20"/>
-              </w:rPr>
-            </w:pPr>
             <w:r>
               <w:rPr>
                 <w:rFonts w:cs="Arial" w:ascii="Arial" w:hAnsi="Arial"/>
@@ -391,6 +399,7 @@
             <w:tcW w:w="2385" w:type="dxa"/>
             <w:tcBorders/>
             <w:shd w:fill="auto" w:val="clear"/>
+            <w:vAlign w:val="center"/>
           </w:tcPr>
           <w:p>
             <w:pPr>
@@ -423,6 +432,7 @@
             <w:gridSpan w:val="3"/>
             <w:tcBorders/>
             <w:shd w:fill="auto" w:val="clear"/>
+            <w:vAlign w:val="center"/>
           </w:tcPr>
           <w:p>
             <w:pPr>
@@ -450,14 +460,14 @@
       <w:pPr>
         <w:pStyle w:val="Normal"/>
         <w:rPr>
-          <w:sz w:val="4"/>
-          <w:szCs w:val="4"/>
+          <w:sz w:val="6"/>
+          <w:szCs w:val="6"/>
         </w:rPr>
       </w:pPr>
       <w:r>
         <w:rPr>
-          <w:sz w:val="4"/>
-          <w:szCs w:val="4"/>
+          <w:sz w:val="6"/>
+          <w:szCs w:val="6"/>
         </w:rPr>
       </w:r>
     </w:p>
@@ -465,7 +475,7 @@
       <w:tblPr>
         <w:tblStyle w:val="Grilledutableau"/>
         <w:tblW w:w="9417" w:type="dxa"/>
-        <w:jc w:val="left"/>
+        <w:jc w:val="center"/>
         <w:tblInd w:w="0" w:type="dxa"/>
         <w:tblCellMar>
           <w:top w:w="0" w:type="dxa"/>
@@ -490,6 +500,7 @@
             <w:gridSpan w:val="3"/>
             <w:tcBorders/>
             <w:shd w:fill="auto" w:val="clear"/>
+            <w:vAlign w:val="center"/>
           </w:tcPr>
           <w:p>
             <w:pPr>
@@ -515,7 +526,7 @@
                 <w:sz w:val="20"/>
                 <w:szCs w:val="20"/>
               </w:rPr>
-              <w:t>{{ title_table_reg }} </w:t>
+              <w:t>{{ title_table_reg }}  </w:t>
             </w:r>
             <w:bookmarkStart w:id="1" w:name="__DdeLink__225_3614400758"/>
             <w:r>
@@ -542,16 +553,14 @@
               <w:top w:val="nil"/>
             </w:tcBorders>
             <w:shd w:fill="auto" w:val="clear"/>
+            <w:vAlign w:val="center"/>
           </w:tcPr>
           <w:p>
             <w:pPr>
               <w:pStyle w:val="Normal"/>
               <w:spacing w:lineRule="auto" w:line="240" w:before="0" w:after="0"/>
               <w:jc w:val="center"/>
-              <w:rPr>
-                <w:sz w:val="20"/>
-                <w:szCs w:val="20"/>
-              </w:rPr>
+              <w:rPr/>
             </w:pPr>
             <w:r>
               <w:rPr>
@@ -570,25 +579,15 @@
               <w:top w:val="nil"/>
             </w:tcBorders>
             <w:shd w:fill="auto" w:val="clear"/>
+            <w:vAlign w:val="center"/>
           </w:tcPr>
           <w:p>
             <w:pPr>
               <w:pStyle w:val="Normal"/>
               <w:spacing w:lineRule="auto" w:line="240" w:before="0" w:after="0"/>
               <w:jc w:val="center"/>
-              <w:rPr>
-                <w:sz w:val="20"/>
-                <w:szCs w:val="20"/>
-              </w:rPr>
-            </w:pPr>
-            <w:r>
-              <w:rPr>
-                <w:rFonts w:cs="Arial" w:ascii="Arial" w:hAnsi="Arial"/>
-                <w:sz w:val="20"/>
-                <w:szCs w:val="20"/>
-              </w:rPr>
-              <w:t xml:space="preserve">   </w:t>
-            </w:r>
+              <w:rPr/>
+            </w:pPr>
             <w:r>
               <w:rPr>
                 <w:rFonts w:cs="Arial" w:ascii="Arial" w:hAnsi="Arial"/>
@@ -597,16 +596,6 @@
               </w:rPr>
               <w:t>{% cellbg  404079 %}</w:t>
             </w:r>
-          </w:p>
-          <w:p>
-            <w:pPr>
-              <w:pStyle w:val="Normal"/>
-              <w:spacing w:lineRule="auto" w:line="240" w:before="0" w:after="0"/>
-              <w:jc w:val="center"/>
-              <w:rPr>
-                <w:color w:val="FFFFFF"/>
-              </w:rPr>
-            </w:pPr>
             <w:r>
               <w:rPr>
                 <w:rFonts w:cs="Arial" w:ascii="Arial" w:hAnsi="Arial"/>
@@ -627,6 +616,7 @@
               <w:top w:val="nil"/>
             </w:tcBorders>
             <w:shd w:fill="auto" w:val="clear"/>
+            <w:vAlign w:val="center"/>
           </w:tcPr>
           <w:p>
             <w:pPr>
@@ -659,6 +649,7 @@
             <w:gridSpan w:val="3"/>
             <w:tcBorders/>
             <w:shd w:fill="auto" w:val="clear"/>
+            <w:vAlign w:val="center"/>
           </w:tcPr>
           <w:p>
             <w:pPr>
@@ -690,6 +681,7 @@
             <w:tcW w:w="2600" w:type="dxa"/>
             <w:tcBorders/>
             <w:shd w:fill="auto" w:val="clear"/>
+            <w:vAlign w:val="center"/>
           </w:tcPr>
           <w:p>
             <w:pPr>
@@ -735,6 +727,7 @@
             <w:tcW w:w="4442" w:type="dxa"/>
             <w:tcBorders/>
             <w:shd w:fill="auto" w:val="clear"/>
+            <w:vAlign w:val="center"/>
           </w:tcPr>
           <w:p>
             <w:pPr>
@@ -750,7 +743,7 @@
                 <w:sz w:val="20"/>
                 <w:szCs w:val="20"/>
               </w:rPr>
-              <w:t>{% cellbg    loop.cycle(‘FFFFFF’, ‘BDBDBD’)</w:t>
+              <w:t>{% cellbg loop.cycle(‘FFFFFF’, ‘BDBDBD’)</w:t>
             </w:r>
           </w:p>
           <w:p>
@@ -776,24 +769,7 @@
                 <w:sz w:val="20"/>
                 <w:szCs w:val="20"/>
               </w:rPr>
-              <w:t>%}</w:t>
-            </w:r>
-          </w:p>
-          <w:p>
-            <w:pPr>
-              <w:pStyle w:val="Normal"/>
-              <w:spacing w:lineRule="auto" w:line="240" w:before="0" w:after="0"/>
-              <w:jc w:val="center"/>
-              <w:rPr/>
-            </w:pPr>
-            <w:r>
-              <w:rPr>
-                <w:rStyle w:val="Textesource"/>
-                <w:rFonts w:cs="Arial" w:ascii="Arial" w:hAnsi="Arial"/>
-                <w:sz w:val="20"/>
-                <w:szCs w:val="20"/>
-              </w:rPr>
-              <w:t xml:space="preserve">{{ col }}  </w:t>
+              <w:t xml:space="preserve">%}{{ col }}  </w:t>
             </w:r>
           </w:p>
         </w:tc>
@@ -802,6 +778,7 @@
             <w:tcW w:w="2375" w:type="dxa"/>
             <w:tcBorders/>
             <w:shd w:fill="auto" w:val="clear"/>
+            <w:vAlign w:val="center"/>
           </w:tcPr>
           <w:p>
             <w:pPr>
@@ -834,6 +811,7 @@
             <w:gridSpan w:val="3"/>
             <w:tcBorders/>
             <w:shd w:fill="auto" w:val="clear"/>
+            <w:vAlign w:val="center"/>
           </w:tcPr>
           <w:p>
             <w:pPr>
@@ -861,14 +839,14 @@
       <w:pPr>
         <w:pStyle w:val="Normal"/>
         <w:rPr>
-          <w:sz w:val="4"/>
-          <w:szCs w:val="4"/>
+          <w:sz w:val="6"/>
+          <w:szCs w:val="6"/>
         </w:rPr>
       </w:pPr>
       <w:r>
         <w:rPr>
-          <w:sz w:val="4"/>
-          <w:szCs w:val="4"/>
+          <w:sz w:val="6"/>
+          <w:szCs w:val="6"/>
         </w:rPr>
       </w:r>
     </w:p>
@@ -876,7 +854,7 @@
       <w:tblPr>
         <w:tblStyle w:val="Grilledutableau"/>
         <w:tblW w:w="9417" w:type="dxa"/>
-        <w:jc w:val="left"/>
+        <w:jc w:val="center"/>
         <w:tblInd w:w="0" w:type="dxa"/>
         <w:tblCellMar>
           <w:top w:w="0" w:type="dxa"/>
@@ -901,16 +879,14 @@
             <w:gridSpan w:val="3"/>
             <w:tcBorders/>
             <w:shd w:fill="auto" w:val="clear"/>
+            <w:vAlign w:val="center"/>
           </w:tcPr>
           <w:p>
             <w:pPr>
               <w:pStyle w:val="Obsahtabulky"/>
               <w:spacing w:lineRule="auto" w:line="240" w:before="0" w:after="0"/>
               <w:jc w:val="center"/>
-              <w:rPr>
-                <w:sz w:val="20"/>
-                <w:szCs w:val="20"/>
-              </w:rPr>
+              <w:rPr/>
             </w:pPr>
             <w:r>
               <w:rPr>
@@ -926,7 +902,7 @@
                 <w:sz w:val="20"/>
                 <w:szCs w:val="20"/>
               </w:rPr>
-              <w:t>{{ title_table_dep }}: {{ lib_dep }}</w:t>
+              <w:t>{{ title_table_nat }}</w:t>
             </w:r>
           </w:p>
         </w:tc>
@@ -942,6 +918,7 @@
               <w:top w:val="nil"/>
             </w:tcBorders>
             <w:shd w:fill="auto" w:val="clear"/>
+            <w:vAlign w:val="center"/>
           </w:tcPr>
           <w:p>
             <w:pPr>
@@ -970,16 +947,14 @@
               <w:top w:val="nil"/>
             </w:tcBorders>
             <w:shd w:fill="auto" w:val="clear"/>
+            <w:vAlign w:val="center"/>
           </w:tcPr>
           <w:p>
             <w:pPr>
               <w:pStyle w:val="Normal"/>
               <w:spacing w:lineRule="auto" w:line="240" w:before="0" w:after="0"/>
               <w:jc w:val="center"/>
-              <w:rPr>
-                <w:sz w:val="20"/>
-                <w:szCs w:val="20"/>
-              </w:rPr>
+              <w:rPr/>
             </w:pPr>
             <w:r>
               <w:rPr>
@@ -989,17 +964,6 @@
               </w:rPr>
               <w:t>{% cellbg  404079 %}</w:t>
             </w:r>
-          </w:p>
-          <w:p>
-            <w:pPr>
-              <w:pStyle w:val="Normal"/>
-              <w:spacing w:lineRule="auto" w:line="240" w:before="0" w:after="0"/>
-              <w:jc w:val="center"/>
-              <w:rPr>
-                <w:sz w:val="20"/>
-                <w:szCs w:val="20"/>
-              </w:rPr>
-            </w:pPr>
             <w:r>
               <w:rPr>
                 <w:rFonts w:cs="Arial" w:ascii="Arial" w:hAnsi="Arial"/>
@@ -1020,6 +984,7 @@
               <w:top w:val="nil"/>
             </w:tcBorders>
             <w:shd w:fill="auto" w:val="clear"/>
+            <w:vAlign w:val="center"/>
           </w:tcPr>
           <w:p>
             <w:pPr>
@@ -1052,24 +1017,22 @@
             <w:gridSpan w:val="3"/>
             <w:tcBorders/>
             <w:shd w:fill="auto" w:val="clear"/>
+            <w:vAlign w:val="center"/>
           </w:tcPr>
           <w:p>
             <w:pPr>
               <w:pStyle w:val="Texteprformat"/>
               <w:spacing w:lineRule="auto" w:line="240" w:before="0" w:after="0"/>
               <w:jc w:val="center"/>
-              <w:rPr>
-                <w:sz w:val="20"/>
-                <w:szCs w:val="20"/>
-              </w:rPr>
-            </w:pPr>
-            <w:r>
-              <w:rPr>
-                <w:rFonts w:cs="Arial" w:ascii="Arial" w:hAnsi="Arial"/>
-                <w:sz w:val="20"/>
-                <w:szCs w:val="20"/>
-              </w:rPr>
-              <w:t>{%tr for item in tbl_contents_dep %}</w:t>
+              <w:rPr/>
+            </w:pPr>
+            <w:r>
+              <w:rPr>
+                <w:rFonts w:cs="Arial" w:ascii="Arial" w:hAnsi="Arial"/>
+                <w:sz w:val="20"/>
+                <w:szCs w:val="20"/>
+              </w:rPr>
+              <w:t>{%tr for item in tbl_contents_nat %}</w:t>
             </w:r>
           </w:p>
         </w:tc>
@@ -1083,6 +1046,7 @@
             <w:tcW w:w="2600" w:type="dxa"/>
             <w:tcBorders/>
             <w:shd w:fill="auto" w:val="clear"/>
+            <w:vAlign w:val="center"/>
           </w:tcPr>
           <w:p>
             <w:pPr>
@@ -1128,6 +1092,7 @@
             <w:tcW w:w="4442" w:type="dxa"/>
             <w:tcBorders/>
             <w:shd w:fill="auto" w:val="clear"/>
+            <w:vAlign w:val="center"/>
           </w:tcPr>
           <w:p>
             <w:pPr>
@@ -1143,7 +1108,7 @@
                 <w:sz w:val="20"/>
                 <w:szCs w:val="20"/>
               </w:rPr>
-              <w:t>{% cellbg    loop.cycle(‘FFFFFF’, ‘BDBDBD’)</w:t>
+              <w:t>{% cellbg loop.cycle(‘FFFFFF’, ‘BDBDBD’)</w:t>
             </w:r>
           </w:p>
           <w:p>
@@ -1171,17 +1136,6 @@
               </w:rPr>
               <w:t>%}</w:t>
             </w:r>
-          </w:p>
-          <w:p>
-            <w:pPr>
-              <w:pStyle w:val="Normal"/>
-              <w:spacing w:lineRule="auto" w:line="240" w:before="0" w:after="0"/>
-              <w:jc w:val="center"/>
-              <w:rPr>
-                <w:sz w:val="20"/>
-                <w:szCs w:val="20"/>
-              </w:rPr>
-            </w:pPr>
             <w:r>
               <w:rPr>
                 <w:rFonts w:cs="Arial" w:ascii="Arial" w:hAnsi="Arial"/>
@@ -1197,6 +1151,7 @@
             <w:tcW w:w="2375" w:type="dxa"/>
             <w:tcBorders/>
             <w:shd w:fill="auto" w:val="clear"/>
+            <w:vAlign w:val="center"/>
           </w:tcPr>
           <w:p>
             <w:pPr>
@@ -1229,6 +1184,7 @@
             <w:gridSpan w:val="3"/>
             <w:tcBorders/>
             <w:shd w:fill="auto" w:val="clear"/>
+            <w:vAlign w:val="center"/>
           </w:tcPr>
           <w:p>
             <w:pPr>
@@ -1247,6 +1203,128 @@
                 <w:szCs w:val="20"/>
               </w:rPr>
               <w:t>{%tr endfor %}</w:t>
+            </w:r>
+          </w:p>
+        </w:tc>
+      </w:tr>
+    </w:tbl>
+    <w:p>
+      <w:pPr>
+        <w:pStyle w:val="Normal"/>
+        <w:spacing w:before="0" w:after="160"/>
+        <w:rPr>
+          <w:sz w:val="6"/>
+          <w:szCs w:val="6"/>
+        </w:rPr>
+      </w:pPr>
+      <w:r>
+        <w:rPr>
+          <w:sz w:val="6"/>
+          <w:szCs w:val="6"/>
+        </w:rPr>
+      </w:r>
+    </w:p>
+    <w:tbl>
+      <w:tblPr>
+        <w:tblW w:w="9519" w:type="dxa"/>
+        <w:jc w:val="center"/>
+        <w:tblInd w:w="0" w:type="dxa"/>
+        <w:tblBorders>
+          <w:top w:val="single" w:sz="2" w:space="0" w:color="000000"/>
+          <w:left w:val="single" w:sz="2" w:space="0" w:color="000000"/>
+          <w:bottom w:val="single" w:sz="2" w:space="0" w:color="000000"/>
+          <w:right w:val="single" w:sz="2" w:space="0" w:color="000000"/>
+          <w:insideH w:val="single" w:sz="2" w:space="0" w:color="000000"/>
+          <w:insideV w:val="single" w:sz="2" w:space="0" w:color="000000"/>
+        </w:tblBorders>
+        <w:tblCellMar>
+          <w:top w:w="55" w:type="dxa"/>
+          <w:left w:w="41" w:type="dxa"/>
+          <w:bottom w:w="55" w:type="dxa"/>
+          <w:right w:w="55" w:type="dxa"/>
+        </w:tblCellMar>
+      </w:tblPr>
+      <w:tblGrid>
+        <w:gridCol w:w="9519"/>
+      </w:tblGrid>
+      <w:tr>
+        <w:trPr>
+          <w:trHeight w:val="2033" w:hRule="atLeast"/>
+        </w:trPr>
+        <w:tc>
+          <w:tcPr>
+            <w:tcW w:w="9519" w:type="dxa"/>
+            <w:tcBorders>
+              <w:top w:val="single" w:sz="2" w:space="0" w:color="000000"/>
+              <w:left w:val="single" w:sz="2" w:space="0" w:color="000000"/>
+              <w:bottom w:val="single" w:sz="2" w:space="0" w:color="000000"/>
+              <w:right w:val="single" w:sz="2" w:space="0" w:color="000000"/>
+              <w:insideH w:val="single" w:sz="2" w:space="0" w:color="000000"/>
+              <w:insideV w:val="single" w:sz="2" w:space="0" w:color="000000"/>
+            </w:tcBorders>
+            <w:shd w:fill="auto" w:val="clear"/>
+          </w:tcPr>
+          <w:p>
+            <w:pPr>
+              <w:pStyle w:val="Contenudecadre"/>
+              <w:overflowPunct w:val="true"/>
+              <w:spacing w:lineRule="auto" w:line="240" w:before="0" w:after="0"/>
+              <w:rPr/>
+            </w:pPr>
+            <w:r>
+              <w:rPr>
+                <w:rFonts w:eastAsia="Calibri" w:cs="" w:cstheme="minorBidi" w:eastAsiaTheme="minorHAnsi"/>
+                <w:b/>
+                <w:bCs/>
+                <w:color w:val="auto"/>
+                <w:sz w:val="20"/>
+                <w:szCs w:val="20"/>
+              </w:rPr>
+              <w:t xml:space="preserve"> </w:t>
+            </w:r>
+            <w:r>
+              <w:rPr>
+                <w:rFonts w:eastAsia="Calibri" w:cs="" w:cstheme="minorBidi" w:eastAsiaTheme="minorHAnsi"/>
+                <w:b/>
+                <w:bCs/>
+                <w:color w:val="auto"/>
+                <w:sz w:val="20"/>
+                <w:szCs w:val="20"/>
+              </w:rPr>
+              <w:t>{{ text_laureats }}</w:t>
+            </w:r>
+            <w:r>
+              <w:rPr>
+                <w:rFonts w:eastAsia="Calibri" w:cs="" w:cstheme="minorBidi" w:eastAsiaTheme="minorHAnsi"/>
+                <w:b w:val="false"/>
+                <w:bCs w:val="false"/>
+                <w:color w:val="auto"/>
+                <w:sz w:val="20"/>
+                <w:szCs w:val="20"/>
+              </w:rPr>
+              <w:t xml:space="preserve"> </w:t>
+            </w:r>
+          </w:p>
+          <w:p>
+            <w:pPr>
+              <w:pStyle w:val="Contenudecadre"/>
+              <w:overflowPunct w:val="true"/>
+              <w:spacing w:lineRule="auto" w:line="240" w:before="0" w:after="0"/>
+              <w:rPr>
+                <w:rFonts w:eastAsia="Calibri" w:cs="" w:cstheme="minorBidi" w:eastAsiaTheme="minorHAnsi"/>
+                <w:color w:val="auto"/>
+                <w:sz w:val="20"/>
+                <w:szCs w:val="20"/>
+              </w:rPr>
+            </w:pPr>
+            <w:r>
+              <w:rPr>
+                <w:rFonts w:eastAsia="Calibri" w:cs="" w:cstheme="minorBidi" w:eastAsiaTheme="minorHAnsi"/>
+                <w:color w:val="auto"/>
+                <w:sz w:val="20"/>
+                <w:szCs w:val="20"/>
+              </w:rPr>
+              <w:t>{{ code_comment }}</w:t>
             </w:r>
           </w:p>
         </w:tc>
@@ -1260,786 +1338,6 @@
       </w:pPr>
       <w:r>
         <w:rPr/>
-        <mc:AlternateContent>
-          <mc:Choice Requires="wps">
-            <w:drawing>
-              <wp:anchor behindDoc="0" distT="0" distB="0" distL="0" distR="0" simplePos="0" locked="0" layoutInCell="1" allowOverlap="1" relativeHeight="2">
-                <wp:simplePos x="0" y="0"/>
-                <wp:positionH relativeFrom="column">
-                  <wp:posOffset>0</wp:posOffset>
-                </wp:positionH>
-                <wp:positionV relativeFrom="paragraph">
-                  <wp:posOffset>28575</wp:posOffset>
-                </wp:positionV>
-                <wp:extent cx="5974080" cy="2425065"/>
-                <wp:effectExtent l="0" t="0" r="0" b="0"/>
-                <wp:wrapNone/>
-                <wp:docPr id="1" name="Forme2"/>
-                <a:graphic xmlns:a="http://schemas.openxmlformats.org/drawingml/2006/main">
-                  <a:graphicData uri="http://schemas.microsoft.com/office/word/2010/wordprocessingShape">
-                    <wps:wsp>
-                      <wps:cNvSpPr/>
-                      <wps:spPr>
-                        <a:xfrm>
-                          <a:off x="0" y="0"/>
-                          <a:ext cx="5973480" cy="2424600"/>
-                        </a:xfrm>
-                        <a:prstGeom prst="rect">
-                          <a:avLst/>
-                        </a:prstGeom>
-                        <a:noFill/>
-                        <a:ln>
-                          <a:solidFill>
-                            <a:srgbClr val="000000"/>
-                          </a:solidFill>
-                        </a:ln>
-                      </wps:spPr>
-                      <wps:style>
-                        <a:lnRef idx="0"/>
-                        <a:fillRef idx="0"/>
-                        <a:effectRef idx="0"/>
-                        <a:fontRef idx="minor"/>
-                      </wps:style>
-                      <wps:bodyPr/>
-                    </wps:wsp>
-                  </a:graphicData>
-                </a:graphic>
-              </wp:anchor>
-            </w:drawing>
-          </mc:Choice>
-          <mc:Fallback>
-            <w:pict>
-              <v:rect id="shape_0" ID="Forme2" stroked="t" style="position:absolute;margin-left:0pt;margin-top:2.25pt;width:470.3pt;height:190.85pt">
-                <w10:wrap type="none"/>
-                <v:fill o:detectmouseclick="t" on="false"/>
-                <v:stroke color="black" joinstyle="round" endcap="flat"/>
-              </v:rect>
-            </w:pict>
-          </mc:Fallback>
-        </mc:AlternateContent>
-        <mc:AlternateContent>
-          <mc:Choice Requires="wps">
-            <w:drawing>
-              <wp:anchor behindDoc="0" distT="0" distB="0" distL="0" distR="0" simplePos="0" locked="0" layoutInCell="1" allowOverlap="1" relativeHeight="3">
-                <wp:simplePos x="0" y="0"/>
-                <wp:positionH relativeFrom="column">
-                  <wp:posOffset>0</wp:posOffset>
-                </wp:positionH>
-                <wp:positionV relativeFrom="paragraph">
-                  <wp:posOffset>28575</wp:posOffset>
-                </wp:positionV>
-                <wp:extent cx="5974080" cy="2651125"/>
-                <wp:effectExtent l="0" t="0" r="0" b="0"/>
-                <wp:wrapNone/>
-                <wp:docPr id="2" name="Cadre1"/>
-                <a:graphic xmlns:a="http://schemas.openxmlformats.org/drawingml/2006/main">
-                  <a:graphicData uri="http://schemas.microsoft.com/office/word/2010/wordprocessingShape">
-                    <wps:wsp>
-                      <wps:cNvSpPr/>
-                      <wps:spPr>
-                        <a:xfrm>
-                          <a:off x="0" y="0"/>
-                          <a:ext cx="5973480" cy="2650320"/>
-                        </a:xfrm>
-                        <a:prstGeom prst="rect">
-                          <a:avLst/>
-                        </a:prstGeom>
-                        <a:noFill/>
-                        <a:ln>
-                          <a:noFill/>
-                        </a:ln>
-                      </wps:spPr>
-                      <wps:style>
-                        <a:lnRef idx="0"/>
-                        <a:fillRef idx="0"/>
-                        <a:effectRef idx="0"/>
-                        <a:fontRef idx="minor"/>
-                      </wps:style>
-                      <wps:txbx>
-                        <w:txbxContent>
-                          <w:p>
-                            <w:pPr>
-                              <w:pStyle w:val="Contenudecadre"/>
-                              <w:overflowPunct w:val="true"/>
-                              <w:spacing w:lineRule="auto" w:line="240" w:before="0" w:after="0"/>
-                              <w:rPr>
-                                <w:sz w:val="20"/>
-                                <w:szCs w:val="20"/>
-                              </w:rPr>
-                            </w:pPr>
-                            <w:r>
-                              <w:rPr>
-                                <w:rFonts w:eastAsia="Calibri" w:cs="" w:cstheme="minorBidi" w:eastAsiaTheme="minorHAnsi"/>
-                                <w:b/>
-                                <w:bCs/>
-                                <w:color w:val="auto"/>
-                                <w:sz w:val="20"/>
-                                <w:szCs w:val="20"/>
-                              </w:rPr>
-                              <w:t xml:space="preserve"> </w:t>
-                            </w:r>
-                            <w:r>
-                              <w:rPr>
-                                <w:rFonts w:eastAsia="Calibri" w:cs="" w:cstheme="minorBidi" w:eastAsiaTheme="minorHAnsi"/>
-                                <w:b/>
-                                <w:bCs/>
-                                <w:color w:val="auto"/>
-                                <w:sz w:val="20"/>
-                                <w:szCs w:val="20"/>
-                              </w:rPr>
-                              <w:t>{{text_laureats}}</w:t>
-                            </w:r>
-                          </w:p>
-                          <w:p>
-                            <w:pPr>
-                              <w:pStyle w:val="Contenudecadre"/>
-                              <w:overflowPunct w:val="true"/>
-                              <w:spacing w:lineRule="auto" w:line="240" w:before="0" w:after="0"/>
-                              <w:rPr>
-                                <w:rFonts w:ascii="Calibri" w:hAnsi="Calibri" w:eastAsia="Calibri" w:cs="" w:asciiTheme="minorHAnsi" w:cstheme="minorBidi" w:eastAsiaTheme="minorHAnsi" w:hAnsiTheme="minorHAnsi"/>
-                                <w:b w:val="false"/>
-                                <w:b w:val="false"/>
-                                <w:bCs w:val="false"/>
-                                <w:color w:val="auto"/>
-                                <w:sz w:val="20"/>
-                                <w:szCs w:val="20"/>
-                              </w:rPr>
-                            </w:pPr>
-                            <w:r>
-                              <w:rPr>
-                                <w:rFonts w:eastAsia="Calibri" w:cs="" w:cstheme="minorBidi" w:eastAsiaTheme="minorHAnsi"/>
-                                <w:b w:val="false"/>
-                                <w:bCs w:val="false"/>
-                                <w:color w:val="auto"/>
-                                <w:sz w:val="20"/>
-                                <w:szCs w:val="20"/>
-                              </w:rPr>
-                              <w:t>{{ code_comment }}</w:t>
-                            </w:r>
-                          </w:p>
-                          <w:p>
-                            <w:pPr>
-                              <w:pStyle w:val="Contenudecadre"/>
-                              <w:overflowPunct w:val="true"/>
-                              <w:spacing w:lineRule="auto" w:line="240" w:before="0" w:after="0"/>
-                              <w:rPr>
-                                <w:rFonts w:ascii="Calibri" w:hAnsi="Calibri" w:eastAsia="Calibri" w:cs="" w:asciiTheme="minorHAnsi" w:cstheme="minorBidi" w:eastAsiaTheme="minorHAnsi" w:hAnsiTheme="minorHAnsi"/>
-                                <w:b/>
-                                <w:b/>
-                                <w:bCs/>
-                                <w:color w:val="auto"/>
-                                <w:sz w:val="20"/>
-                                <w:szCs w:val="20"/>
-                              </w:rPr>
-                            </w:pPr>
-                            <w:r>
-                              <w:rPr>
-                                <w:rFonts w:eastAsia="Calibri" w:cs="" w:cstheme="minorBidi" w:eastAsiaTheme="minorHAnsi"/>
-                                <w:b/>
-                                <w:bCs/>
-                                <w:color w:val="auto"/>
-                                <w:sz w:val="20"/>
-                                <w:szCs w:val="20"/>
-                              </w:rPr>
-                            </w:r>
-                          </w:p>
-                          <w:p>
-                            <w:pPr>
-                              <w:pStyle w:val="Contenudecadre"/>
-                              <w:overflowPunct w:val="true"/>
-                              <w:spacing w:lineRule="auto" w:line="240" w:before="0" w:after="0"/>
-                              <w:rPr>
-                                <w:rFonts w:ascii="Calibri" w:hAnsi="Calibri" w:eastAsia="Calibri" w:cs="" w:asciiTheme="minorHAnsi" w:cstheme="minorBidi" w:eastAsiaTheme="minorHAnsi" w:hAnsiTheme="minorHAnsi"/>
-                                <w:b/>
-                                <w:b/>
-                                <w:bCs/>
-                                <w:color w:val="auto"/>
-                                <w:sz w:val="20"/>
-                                <w:szCs w:val="20"/>
-                              </w:rPr>
-                            </w:pPr>
-                            <w:r>
-                              <w:rPr>
-                                <w:rFonts w:eastAsia="Calibri" w:cs="" w:cstheme="minorBidi" w:eastAsiaTheme="minorHAnsi"/>
-                                <w:b/>
-                                <w:bCs/>
-                                <w:color w:val="auto"/>
-                                <w:sz w:val="20"/>
-                                <w:szCs w:val="20"/>
-                              </w:rPr>
-                            </w:r>
-                          </w:p>
-                          <w:p>
-                            <w:pPr>
-                              <w:pStyle w:val="Contenudecadre"/>
-                              <w:overflowPunct w:val="true"/>
-                              <w:spacing w:lineRule="auto" w:line="240" w:before="0" w:after="0"/>
-                              <w:rPr>
-                                <w:rFonts w:ascii="Calibri" w:hAnsi="Calibri" w:eastAsia="Calibri" w:cs="" w:asciiTheme="minorHAnsi" w:cstheme="minorBidi" w:eastAsiaTheme="minorHAnsi" w:hAnsiTheme="minorHAnsi"/>
-                                <w:b/>
-                                <w:b/>
-                                <w:bCs/>
-                                <w:color w:val="auto"/>
-                                <w:sz w:val="20"/>
-                                <w:szCs w:val="20"/>
-                              </w:rPr>
-                            </w:pPr>
-                            <w:r>
-                              <w:rPr>
-                                <w:rFonts w:eastAsia="Calibri" w:cs="" w:cstheme="minorBidi" w:eastAsiaTheme="minorHAnsi"/>
-                                <w:b/>
-                                <w:bCs/>
-                                <w:color w:val="auto"/>
-                                <w:sz w:val="20"/>
-                                <w:szCs w:val="20"/>
-                              </w:rPr>
-                            </w:r>
-                          </w:p>
-                          <w:p>
-                            <w:pPr>
-                              <w:pStyle w:val="Contenudecadre"/>
-                              <w:overflowPunct w:val="true"/>
-                              <w:spacing w:lineRule="auto" w:line="240" w:before="0" w:after="0"/>
-                              <w:rPr>
-                                <w:rFonts w:ascii="Calibri" w:hAnsi="Calibri" w:eastAsia="Calibri" w:cs="" w:asciiTheme="minorHAnsi" w:cstheme="minorBidi" w:eastAsiaTheme="minorHAnsi" w:hAnsiTheme="minorHAnsi"/>
-                                <w:b/>
-                                <w:b/>
-                                <w:bCs/>
-                                <w:color w:val="auto"/>
-                                <w:sz w:val="20"/>
-                                <w:szCs w:val="20"/>
-                              </w:rPr>
-                            </w:pPr>
-                            <w:r>
-                              <w:rPr>
-                                <w:rFonts w:eastAsia="Calibri" w:cs="" w:cstheme="minorBidi" w:eastAsiaTheme="minorHAnsi"/>
-                                <w:b/>
-                                <w:bCs/>
-                                <w:color w:val="auto"/>
-                                <w:sz w:val="20"/>
-                                <w:szCs w:val="20"/>
-                              </w:rPr>
-                            </w:r>
-                          </w:p>
-                          <w:p>
-                            <w:pPr>
-                              <w:pStyle w:val="Contenudecadre"/>
-                              <w:overflowPunct w:val="true"/>
-                              <w:spacing w:lineRule="auto" w:line="240" w:before="0" w:after="0"/>
-                              <w:rPr>
-                                <w:rFonts w:ascii="Calibri" w:hAnsi="Calibri" w:eastAsia="Calibri" w:cs="" w:asciiTheme="minorHAnsi" w:cstheme="minorBidi" w:eastAsiaTheme="minorHAnsi" w:hAnsiTheme="minorHAnsi"/>
-                                <w:b/>
-                                <w:b/>
-                                <w:bCs/>
-                                <w:color w:val="auto"/>
-                                <w:sz w:val="20"/>
-                                <w:szCs w:val="20"/>
-                              </w:rPr>
-                            </w:pPr>
-                            <w:r>
-                              <w:rPr>
-                                <w:rFonts w:eastAsia="Calibri" w:cs="" w:cstheme="minorBidi" w:eastAsiaTheme="minorHAnsi"/>
-                                <w:b/>
-                                <w:bCs/>
-                                <w:color w:val="auto"/>
-                                <w:sz w:val="20"/>
-                                <w:szCs w:val="20"/>
-                              </w:rPr>
-                            </w:r>
-                          </w:p>
-                          <w:p>
-                            <w:pPr>
-                              <w:pStyle w:val="Contenudecadre"/>
-                              <w:overflowPunct w:val="true"/>
-                              <w:spacing w:lineRule="auto" w:line="240" w:before="0" w:after="0"/>
-                              <w:rPr>
-                                <w:rFonts w:ascii="Calibri" w:hAnsi="Calibri" w:eastAsia="Calibri" w:cs="" w:asciiTheme="minorHAnsi" w:cstheme="minorBidi" w:eastAsiaTheme="minorHAnsi" w:hAnsiTheme="minorHAnsi"/>
-                                <w:b/>
-                                <w:b/>
-                                <w:bCs/>
-                                <w:color w:val="auto"/>
-                                <w:sz w:val="20"/>
-                                <w:szCs w:val="20"/>
-                              </w:rPr>
-                            </w:pPr>
-                            <w:r>
-                              <w:rPr>
-                                <w:rFonts w:eastAsia="Calibri" w:cs="" w:cstheme="minorBidi" w:eastAsiaTheme="minorHAnsi"/>
-                                <w:b/>
-                                <w:bCs/>
-                                <w:color w:val="auto"/>
-                                <w:sz w:val="20"/>
-                                <w:szCs w:val="20"/>
-                              </w:rPr>
-                            </w:r>
-                          </w:p>
-                          <w:p>
-                            <w:pPr>
-                              <w:pStyle w:val="Contenudecadre"/>
-                              <w:overflowPunct w:val="true"/>
-                              <w:spacing w:lineRule="auto" w:line="240" w:before="0" w:after="0"/>
-                              <w:rPr>
-                                <w:sz w:val="20"/>
-                                <w:szCs w:val="20"/>
-                              </w:rPr>
-                            </w:pPr>
-                            <w:r>
-                              <w:rPr>
-                                <w:sz w:val="20"/>
-                                <w:szCs w:val="20"/>
-                              </w:rPr>
-                            </w:r>
-                          </w:p>
-                          <w:p>
-                            <w:pPr>
-                              <w:pStyle w:val="Contenudecadre"/>
-                              <w:overflowPunct w:val="true"/>
-                              <w:spacing w:lineRule="auto" w:line="240" w:before="0" w:after="0"/>
-                              <w:rPr>
-                                <w:sz w:val="20"/>
-                                <w:szCs w:val="20"/>
-                              </w:rPr>
-                            </w:pPr>
-                            <w:r>
-                              <w:rPr>
-                                <w:sz w:val="20"/>
-                                <w:szCs w:val="20"/>
-                              </w:rPr>
-                            </w:r>
-                          </w:p>
-                          <w:p>
-                            <w:pPr>
-                              <w:pStyle w:val="Contenudecadre"/>
-                              <w:overflowPunct w:val="true"/>
-                              <w:spacing w:lineRule="auto" w:line="240" w:before="0" w:after="0"/>
-                              <w:rPr>
-                                <w:sz w:val="20"/>
-                                <w:szCs w:val="20"/>
-                              </w:rPr>
-                            </w:pPr>
-                            <w:r>
-                              <w:rPr>
-                                <w:sz w:val="20"/>
-                                <w:szCs w:val="20"/>
-                              </w:rPr>
-                            </w:r>
-                          </w:p>
-                          <w:p>
-                            <w:pPr>
-                              <w:pStyle w:val="Contenudecadre"/>
-                              <w:overflowPunct w:val="true"/>
-                              <w:spacing w:lineRule="auto" w:line="240" w:before="0" w:after="0"/>
-                              <w:rPr>
-                                <w:sz w:val="20"/>
-                                <w:szCs w:val="20"/>
-                              </w:rPr>
-                            </w:pPr>
-                            <w:r>
-                              <w:rPr>
-                                <w:sz w:val="20"/>
-                                <w:szCs w:val="20"/>
-                              </w:rPr>
-                            </w:r>
-                          </w:p>
-                          <w:p>
-                            <w:pPr>
-                              <w:pStyle w:val="Contenudecadre"/>
-                              <w:overflowPunct w:val="true"/>
-                              <w:spacing w:lineRule="auto" w:line="240" w:before="0" w:after="0"/>
-                              <w:rPr>
-                                <w:sz w:val="20"/>
-                                <w:szCs w:val="20"/>
-                              </w:rPr>
-                            </w:pPr>
-                            <w:r>
-                              <w:rPr>
-                                <w:sz w:val="20"/>
-                                <w:szCs w:val="20"/>
-                              </w:rPr>
-                            </w:r>
-                          </w:p>
-                          <w:p>
-                            <w:pPr>
-                              <w:pStyle w:val="Contenudecadre"/>
-                              <w:overflowPunct w:val="true"/>
-                              <w:spacing w:lineRule="auto" w:line="240" w:before="0" w:after="0"/>
-                              <w:rPr>
-                                <w:sz w:val="20"/>
-                                <w:szCs w:val="20"/>
-                              </w:rPr>
-                            </w:pPr>
-                            <w:r>
-                              <w:rPr>
-                                <w:sz w:val="20"/>
-                                <w:szCs w:val="20"/>
-                              </w:rPr>
-                            </w:r>
-                          </w:p>
-                          <w:p>
-                            <w:pPr>
-                              <w:pStyle w:val="Contenudecadre"/>
-                              <w:overflowPunct w:val="true"/>
-                              <w:spacing w:lineRule="auto" w:line="240" w:before="0" w:after="0"/>
-                              <w:rPr/>
-                            </w:pPr>
-                            <w:r>
-                              <w:rPr/>
-                            </w:r>
-                          </w:p>
-                        </w:txbxContent>
-                      </wps:txbx>
-                      <wps:bodyPr lIns="0" rIns="0" tIns="0" bIns="0">
-                        <a:noAutofit/>
-                      </wps:bodyPr>
-                    </wps:wsp>
-                  </a:graphicData>
-                </a:graphic>
-              </wp:anchor>
-            </w:drawing>
-          </mc:Choice>
-          <mc:Fallback>
-            <w:pict>
-              <v:rect id="shape_0" ID="Cadre1" stroked="f" style="position:absolute;margin-left:0pt;margin-top:2.25pt;width:470.3pt;height:208.65pt">
-                <w10:wrap type="square"/>
-                <v:fill o:detectmouseclick="t" on="false"/>
-                <v:stroke color="#3465a4" joinstyle="round" endcap="flat"/>
-                <v:textbox>
-                  <w:txbxContent>
-                    <w:p>
-                      <w:pPr>
-                        <w:pStyle w:val="Contenudecadre"/>
-                        <w:overflowPunct w:val="true"/>
-                        <w:spacing w:lineRule="auto" w:line="240" w:before="0" w:after="0"/>
-                        <w:rPr>
-                          <w:sz w:val="20"/>
-                          <w:szCs w:val="20"/>
-                        </w:rPr>
-                      </w:pPr>
-                      <w:r>
-                        <w:rPr>
-                          <w:rFonts w:eastAsia="Calibri" w:cs="" w:cstheme="minorBidi" w:eastAsiaTheme="minorHAnsi"/>
-                          <w:b/>
-                          <w:bCs/>
-                          <w:color w:val="auto"/>
-                          <w:sz w:val="20"/>
-                          <w:szCs w:val="20"/>
-                        </w:rPr>
-                        <w:t xml:space="preserve"> </w:t>
-                      </w:r>
-                      <w:r>
-                        <w:rPr>
-                          <w:rFonts w:eastAsia="Calibri" w:cs="" w:cstheme="minorBidi" w:eastAsiaTheme="minorHAnsi"/>
-                          <w:b/>
-                          <w:bCs/>
-                          <w:color w:val="auto"/>
-                          <w:sz w:val="20"/>
-                          <w:szCs w:val="20"/>
-                        </w:rPr>
-                        <w:t>{{text_laureats}}</w:t>
-                      </w:r>
-                    </w:p>
-                    <w:p>
-                      <w:pPr>
-                        <w:pStyle w:val="Contenudecadre"/>
-                        <w:overflowPunct w:val="true"/>
-                        <w:spacing w:lineRule="auto" w:line="240" w:before="0" w:after="0"/>
-                        <w:rPr>
-                          <w:rFonts w:ascii="Calibri" w:hAnsi="Calibri" w:eastAsia="Calibri" w:cs="" w:asciiTheme="minorHAnsi" w:cstheme="minorBidi" w:eastAsiaTheme="minorHAnsi" w:hAnsiTheme="minorHAnsi"/>
-                          <w:b w:val="false"/>
-                          <w:b w:val="false"/>
-                          <w:bCs w:val="false"/>
-                          <w:color w:val="auto"/>
-                          <w:sz w:val="20"/>
-                          <w:szCs w:val="20"/>
-                        </w:rPr>
-                      </w:pPr>
-                      <w:r>
-                        <w:rPr>
-                          <w:rFonts w:eastAsia="Calibri" w:cs="" w:cstheme="minorBidi" w:eastAsiaTheme="minorHAnsi"/>
-                          <w:b w:val="false"/>
-                          <w:bCs w:val="false"/>
-                          <w:color w:val="auto"/>
-                          <w:sz w:val="20"/>
-                          <w:szCs w:val="20"/>
-                        </w:rPr>
-                        <w:t>{{ code_comment }}</w:t>
-                      </w:r>
-                    </w:p>
-                    <w:p>
-                      <w:pPr>
-                        <w:pStyle w:val="Contenudecadre"/>
-                        <w:overflowPunct w:val="true"/>
-                        <w:spacing w:lineRule="auto" w:line="240" w:before="0" w:after="0"/>
-                        <w:rPr>
-                          <w:rFonts w:ascii="Calibri" w:hAnsi="Calibri" w:eastAsia="Calibri" w:cs="" w:asciiTheme="minorHAnsi" w:cstheme="minorBidi" w:eastAsiaTheme="minorHAnsi" w:hAnsiTheme="minorHAnsi"/>
-                          <w:b/>
-                          <w:b/>
-                          <w:bCs/>
-                          <w:color w:val="auto"/>
-                          <w:sz w:val="20"/>
-                          <w:szCs w:val="20"/>
-                        </w:rPr>
-                      </w:pPr>
-                      <w:r>
-                        <w:rPr>
-                          <w:rFonts w:eastAsia="Calibri" w:cs="" w:cstheme="minorBidi" w:eastAsiaTheme="minorHAnsi"/>
-                          <w:b/>
-                          <w:bCs/>
-                          <w:color w:val="auto"/>
-                          <w:sz w:val="20"/>
-                          <w:szCs w:val="20"/>
-                        </w:rPr>
-                      </w:r>
-                    </w:p>
-                    <w:p>
-                      <w:pPr>
-                        <w:pStyle w:val="Contenudecadre"/>
-                        <w:overflowPunct w:val="true"/>
-                        <w:spacing w:lineRule="auto" w:line="240" w:before="0" w:after="0"/>
-                        <w:rPr>
-                          <w:rFonts w:ascii="Calibri" w:hAnsi="Calibri" w:eastAsia="Calibri" w:cs="" w:asciiTheme="minorHAnsi" w:cstheme="minorBidi" w:eastAsiaTheme="minorHAnsi" w:hAnsiTheme="minorHAnsi"/>
-                          <w:b/>
-                          <w:b/>
-                          <w:bCs/>
-                          <w:color w:val="auto"/>
-                          <w:sz w:val="20"/>
-                          <w:szCs w:val="20"/>
-                        </w:rPr>
-                      </w:pPr>
-                      <w:r>
-                        <w:rPr>
-                          <w:rFonts w:eastAsia="Calibri" w:cs="" w:cstheme="minorBidi" w:eastAsiaTheme="minorHAnsi"/>
-                          <w:b/>
-                          <w:bCs/>
-                          <w:color w:val="auto"/>
-                          <w:sz w:val="20"/>
-                          <w:szCs w:val="20"/>
-                        </w:rPr>
-                      </w:r>
-                    </w:p>
-                    <w:p>
-                      <w:pPr>
-                        <w:pStyle w:val="Contenudecadre"/>
-                        <w:overflowPunct w:val="true"/>
-                        <w:spacing w:lineRule="auto" w:line="240" w:before="0" w:after="0"/>
-                        <w:rPr>
-                          <w:rFonts w:ascii="Calibri" w:hAnsi="Calibri" w:eastAsia="Calibri" w:cs="" w:asciiTheme="minorHAnsi" w:cstheme="minorBidi" w:eastAsiaTheme="minorHAnsi" w:hAnsiTheme="minorHAnsi"/>
-                          <w:b/>
-                          <w:b/>
-                          <w:bCs/>
-                          <w:color w:val="auto"/>
-                          <w:sz w:val="20"/>
-                          <w:szCs w:val="20"/>
-                        </w:rPr>
-                      </w:pPr>
-                      <w:r>
-                        <w:rPr>
-                          <w:rFonts w:eastAsia="Calibri" w:cs="" w:cstheme="minorBidi" w:eastAsiaTheme="minorHAnsi"/>
-                          <w:b/>
-                          <w:bCs/>
-                          <w:color w:val="auto"/>
-                          <w:sz w:val="20"/>
-                          <w:szCs w:val="20"/>
-                        </w:rPr>
-                      </w:r>
-                    </w:p>
-                    <w:p>
-                      <w:pPr>
-                        <w:pStyle w:val="Contenudecadre"/>
-                        <w:overflowPunct w:val="true"/>
-                        <w:spacing w:lineRule="auto" w:line="240" w:before="0" w:after="0"/>
-                        <w:rPr>
-                          <w:rFonts w:ascii="Calibri" w:hAnsi="Calibri" w:eastAsia="Calibri" w:cs="" w:asciiTheme="minorHAnsi" w:cstheme="minorBidi" w:eastAsiaTheme="minorHAnsi" w:hAnsiTheme="minorHAnsi"/>
-                          <w:b/>
-                          <w:b/>
-                          <w:bCs/>
-                          <w:color w:val="auto"/>
-                          <w:sz w:val="20"/>
-                          <w:szCs w:val="20"/>
-                        </w:rPr>
-                      </w:pPr>
-                      <w:r>
-                        <w:rPr>
-                          <w:rFonts w:eastAsia="Calibri" w:cs="" w:cstheme="minorBidi" w:eastAsiaTheme="minorHAnsi"/>
-                          <w:b/>
-                          <w:bCs/>
-                          <w:color w:val="auto"/>
-                          <w:sz w:val="20"/>
-                          <w:szCs w:val="20"/>
-                        </w:rPr>
-                      </w:r>
-                    </w:p>
-                    <w:p>
-                      <w:pPr>
-                        <w:pStyle w:val="Contenudecadre"/>
-                        <w:overflowPunct w:val="true"/>
-                        <w:spacing w:lineRule="auto" w:line="240" w:before="0" w:after="0"/>
-                        <w:rPr>
-                          <w:rFonts w:ascii="Calibri" w:hAnsi="Calibri" w:eastAsia="Calibri" w:cs="" w:asciiTheme="minorHAnsi" w:cstheme="minorBidi" w:eastAsiaTheme="minorHAnsi" w:hAnsiTheme="minorHAnsi"/>
-                          <w:b/>
-                          <w:b/>
-                          <w:bCs/>
-                          <w:color w:val="auto"/>
-                          <w:sz w:val="20"/>
-                          <w:szCs w:val="20"/>
-                        </w:rPr>
-                      </w:pPr>
-                      <w:r>
-                        <w:rPr>
-                          <w:rFonts w:eastAsia="Calibri" w:cs="" w:cstheme="minorBidi" w:eastAsiaTheme="minorHAnsi"/>
-                          <w:b/>
-                          <w:bCs/>
-                          <w:color w:val="auto"/>
-                          <w:sz w:val="20"/>
-                          <w:szCs w:val="20"/>
-                        </w:rPr>
-                      </w:r>
-                    </w:p>
-                    <w:p>
-                      <w:pPr>
-                        <w:pStyle w:val="Contenudecadre"/>
-                        <w:overflowPunct w:val="true"/>
-                        <w:spacing w:lineRule="auto" w:line="240" w:before="0" w:after="0"/>
-                        <w:rPr>
-                          <w:rFonts w:ascii="Calibri" w:hAnsi="Calibri" w:eastAsia="Calibri" w:cs="" w:asciiTheme="minorHAnsi" w:cstheme="minorBidi" w:eastAsiaTheme="minorHAnsi" w:hAnsiTheme="minorHAnsi"/>
-                          <w:b/>
-                          <w:b/>
-                          <w:bCs/>
-                          <w:color w:val="auto"/>
-                          <w:sz w:val="20"/>
-                          <w:szCs w:val="20"/>
-                        </w:rPr>
-                      </w:pPr>
-                      <w:r>
-                        <w:rPr>
-                          <w:rFonts w:eastAsia="Calibri" w:cs="" w:cstheme="minorBidi" w:eastAsiaTheme="minorHAnsi"/>
-                          <w:b/>
-                          <w:bCs/>
-                          <w:color w:val="auto"/>
-                          <w:sz w:val="20"/>
-                          <w:szCs w:val="20"/>
-                        </w:rPr>
-                      </w:r>
-                    </w:p>
-                    <w:p>
-                      <w:pPr>
-                        <w:pStyle w:val="Contenudecadre"/>
-                        <w:overflowPunct w:val="true"/>
-                        <w:spacing w:lineRule="auto" w:line="240" w:before="0" w:after="0"/>
-                        <w:rPr>
-                          <w:sz w:val="20"/>
-                          <w:szCs w:val="20"/>
-                        </w:rPr>
-                      </w:pPr>
-                      <w:r>
-                        <w:rPr>
-                          <w:sz w:val="20"/>
-                          <w:szCs w:val="20"/>
-                        </w:rPr>
-                      </w:r>
-                    </w:p>
-                    <w:p>
-                      <w:pPr>
-                        <w:pStyle w:val="Contenudecadre"/>
-                        <w:overflowPunct w:val="true"/>
-                        <w:spacing w:lineRule="auto" w:line="240" w:before="0" w:after="0"/>
-                        <w:rPr>
-                          <w:sz w:val="20"/>
-                          <w:szCs w:val="20"/>
-                        </w:rPr>
-                      </w:pPr>
-                      <w:r>
-                        <w:rPr>
-                          <w:sz w:val="20"/>
-                          <w:szCs w:val="20"/>
-                        </w:rPr>
-                      </w:r>
-                    </w:p>
-                    <w:p>
-                      <w:pPr>
-                        <w:pStyle w:val="Contenudecadre"/>
-                        <w:overflowPunct w:val="true"/>
-                        <w:spacing w:lineRule="auto" w:line="240" w:before="0" w:after="0"/>
-                        <w:rPr>
-                          <w:sz w:val="20"/>
-                          <w:szCs w:val="20"/>
-                        </w:rPr>
-                      </w:pPr>
-                      <w:r>
-                        <w:rPr>
-                          <w:sz w:val="20"/>
-                          <w:szCs w:val="20"/>
-                        </w:rPr>
-                      </w:r>
-                    </w:p>
-                    <w:p>
-                      <w:pPr>
-                        <w:pStyle w:val="Contenudecadre"/>
-                        <w:overflowPunct w:val="true"/>
-                        <w:spacing w:lineRule="auto" w:line="240" w:before="0" w:after="0"/>
-                        <w:rPr>
-                          <w:sz w:val="20"/>
-                          <w:szCs w:val="20"/>
-                        </w:rPr>
-                      </w:pPr>
-                      <w:r>
-                        <w:rPr>
-                          <w:sz w:val="20"/>
-                          <w:szCs w:val="20"/>
-                        </w:rPr>
-                      </w:r>
-                    </w:p>
-                    <w:p>
-                      <w:pPr>
-                        <w:pStyle w:val="Contenudecadre"/>
-                        <w:overflowPunct w:val="true"/>
-                        <w:spacing w:lineRule="auto" w:line="240" w:before="0" w:after="0"/>
-                        <w:rPr>
-                          <w:sz w:val="20"/>
-                          <w:szCs w:val="20"/>
-                        </w:rPr>
-                      </w:pPr>
-                      <w:r>
-                        <w:rPr>
-                          <w:sz w:val="20"/>
-                          <w:szCs w:val="20"/>
-                        </w:rPr>
-                      </w:r>
-                    </w:p>
-                    <w:p>
-                      <w:pPr>
-                        <w:pStyle w:val="Contenudecadre"/>
-                        <w:overflowPunct w:val="true"/>
-                        <w:spacing w:lineRule="auto" w:line="240" w:before="0" w:after="0"/>
-                        <w:rPr>
-                          <w:sz w:val="20"/>
-                          <w:szCs w:val="20"/>
-                        </w:rPr>
-                      </w:pPr>
-                      <w:r>
-                        <w:rPr>
-                          <w:sz w:val="20"/>
-                          <w:szCs w:val="20"/>
-                        </w:rPr>
-                      </w:r>
-                    </w:p>
-                    <w:p>
-                      <w:pPr>
-                        <w:pStyle w:val="Contenudecadre"/>
-                        <w:overflowPunct w:val="true"/>
-                        <w:spacing w:lineRule="auto" w:line="240" w:before="0" w:after="0"/>
-                        <w:rPr/>
-                      </w:pPr>
-                      <w:r>
-                        <w:rPr/>
-                      </w:r>
-                    </w:p>
-                  </w:txbxContent>
-                </v:textbox>
-              </v:rect>
-            </w:pict>
-          </mc:Fallback>
-        </mc:AlternateContent>
       </w:r>
     </w:p>
     <w:sectPr>
@@ -2068,18 +1366,18 @@
       <mc:AlternateContent>
         <mc:Choice Requires="wps">
           <w:drawing>
-            <wp:anchor behindDoc="1" distT="0" distB="0" distL="114300" distR="49530" simplePos="0" locked="0" layoutInCell="1" allowOverlap="1" relativeHeight="5">
+            <wp:anchor behindDoc="1" distT="0" distB="0" distL="114300" distR="49530" simplePos="0" locked="0" layoutInCell="1" allowOverlap="1" relativeHeight="3">
               <wp:simplePos x="0" y="0"/>
               <wp:positionH relativeFrom="column">
                 <wp:posOffset>4748530</wp:posOffset>
               </wp:positionH>
               <wp:positionV relativeFrom="paragraph">
-                <wp:posOffset>-331470</wp:posOffset>
+                <wp:posOffset>-321310</wp:posOffset>
               </wp:positionV>
-              <wp:extent cx="1613535" cy="1080135"/>
+              <wp:extent cx="1079500" cy="745490"/>
               <wp:effectExtent l="0" t="0" r="64770" b="64770"/>
               <wp:wrapSquare wrapText="bothSides"/>
-              <wp:docPr id="4" name="Image 2"/>
+              <wp:docPr id="1" name="Image 2"/>
               <a:graphic xmlns:a="http://schemas.openxmlformats.org/drawingml/2006/main">
                 <a:graphicData uri="http://schemas.openxmlformats.org/drawingml/2006/picture">
                   <pic:pic xmlns:pic="http://schemas.openxmlformats.org/drawingml/2006/picture">
@@ -2095,7 +1393,7 @@
                     <pic:spPr>
                       <a:xfrm>
                         <a:off x="0" y="0"/>
-                        <a:ext cx="1612800" cy="1079640"/>
+                        <a:ext cx="1078920" cy="744840"/>
                       </a:xfrm>
                       <a:prstGeom prst="rect">
                         <a:avLst/>
@@ -2136,7 +1434,7 @@
               <v:path o:extrusionok="f" gradientshapeok="t" o:connecttype="rect"/>
               <o:lock v:ext="edit" aspectratio="t"/>
             </v:shapetype>
-            <v:shape id="shape_0" ID="Image 2" stroked="f" style="position:absolute;margin-left:373.9pt;margin-top:-26.1pt;width:126.95pt;height:84.95pt" type="shapetype_75">
+            <v:shape id="shape_0" ID="Image 2" stroked="f" style="position:absolute;margin-left:373.9pt;margin-top:-25.3pt;width:84.9pt;height:58.6pt" type="shapetype_75">
               <v:imagedata r:id="rId1" o:detectmouseclick="t"/>
               <w10:wrap type="none"/>
               <v:stroke color="#3465a4" joinstyle="round" endcap="flat"/>
@@ -2145,7 +1443,7 @@
         </mc:Fallback>
       </mc:AlternateContent>
       <w:drawing>
-        <wp:anchor behindDoc="1" distT="0" distB="9525" distL="114300" distR="114300" simplePos="0" locked="0" layoutInCell="1" allowOverlap="1" relativeHeight="4">
+        <wp:anchor behindDoc="1" distT="0" distB="9525" distL="114300" distR="114300" simplePos="0" locked="0" layoutInCell="1" allowOverlap="1" relativeHeight="2">
           <wp:simplePos x="0" y="0"/>
           <wp:positionH relativeFrom="column">
             <wp:posOffset>-385445</wp:posOffset>
@@ -2153,10 +1451,10 @@
           <wp:positionV relativeFrom="paragraph">
             <wp:posOffset>-211455</wp:posOffset>
           </wp:positionV>
-          <wp:extent cx="1087120" cy="981075"/>
+          <wp:extent cx="754380" cy="680720"/>
           <wp:effectExtent l="0" t="0" r="0" b="0"/>
           <wp:wrapSquare wrapText="bothSides"/>
-          <wp:docPr id="5" name="Image2" descr=""/>
+          <wp:docPr id="2" name="Image2" descr=""/>
           <wp:cNvGraphicFramePr>
             <a:graphicFrameLocks xmlns:a="http://schemas.openxmlformats.org/drawingml/2006/main" noChangeAspect="1"/>
           </wp:cNvGraphicFramePr>
@@ -2164,7 +1462,7 @@
             <a:graphicData uri="http://schemas.openxmlformats.org/drawingml/2006/picture">
               <pic:pic xmlns:pic="http://schemas.openxmlformats.org/drawingml/2006/picture">
                 <pic:nvPicPr>
-                  <pic:cNvPr id="5" name="Image2" descr=""/>
+                  <pic:cNvPr id="2" name="Image2" descr=""/>
                   <pic:cNvPicPr>
                     <a:picLocks noChangeAspect="1" noChangeArrowheads="1"/>
                   </pic:cNvPicPr>
@@ -2178,7 +1476,7 @@
                 <pic:spPr bwMode="auto">
                   <a:xfrm>
                     <a:off x="0" y="0"/>
-                    <a:ext cx="1087120" cy="981075"/>
+                    <a:ext cx="754380" cy="680720"/>
                   </a:xfrm>
                   <a:prstGeom prst="rect">
                     <a:avLst/>
@@ -2192,6 +1490,203 @@
     </w:r>
   </w:p>
 </w:hdr>
+</file>
+
+<file path=word/numbering.xml><?xml version="1.0" encoding="utf-8"?>
+<w:numbering xmlns:w="http://schemas.openxmlformats.org/wordprocessingml/2006/main" xmlns:o="urn:schemas-microsoft-com:office:office" xmlns:r="http://schemas.openxmlformats.org/officeDocument/2006/relationships" xmlns:v="urn:schemas-microsoft-com:vml">
+  <w:abstractNum w:abstractNumId="1">
+    <w:lvl w:ilvl="0">
+      <w:start w:val="1"/>
+      <w:numFmt w:val="none"/>
+      <w:suff w:val="nothing"/>
+      <w:lvlText w:val=""/>
+      <w:lvlJc w:val="left"/>
+      <w:pPr>
+        <w:ind w:left="0" w:hanging="0"/>
+      </w:pPr>
+    </w:lvl>
+    <w:lvl w:ilvl="1">
+      <w:start w:val="1"/>
+      <w:pStyle w:val="Titre2"/>
+      <w:numFmt w:val="none"/>
+      <w:suff w:val="nothing"/>
+      <w:lvlText w:val=""/>
+      <w:lvlJc w:val="left"/>
+      <w:pPr>
+        <w:ind w:left="0" w:hanging="0"/>
+      </w:pPr>
+    </w:lvl>
+    <w:lvl w:ilvl="2">
+      <w:start w:val="1"/>
+      <w:pStyle w:val="Titre3"/>
+      <w:numFmt w:val="none"/>
+      <w:suff w:val="nothing"/>
+      <w:lvlText w:val=""/>
+      <w:lvlJc w:val="left"/>
+      <w:pPr>
+        <w:ind w:left="0" w:hanging="0"/>
+      </w:pPr>
+    </w:lvl>
+    <w:lvl w:ilvl="3">
+      <w:start w:val="1"/>
+      <w:numFmt w:val="none"/>
+      <w:suff w:val="nothing"/>
+      <w:lvlText w:val=""/>
+      <w:lvlJc w:val="left"/>
+      <w:pPr>
+        <w:ind w:left="0" w:hanging="0"/>
+      </w:pPr>
+    </w:lvl>
+    <w:lvl w:ilvl="4">
+      <w:start w:val="1"/>
+      <w:numFmt w:val="none"/>
+      <w:suff w:val="nothing"/>
+      <w:lvlText w:val=""/>
+      <w:lvlJc w:val="left"/>
+      <w:pPr>
+        <w:ind w:left="0" w:hanging="0"/>
+      </w:pPr>
+    </w:lvl>
+    <w:lvl w:ilvl="5">
+      <w:start w:val="1"/>
+      <w:numFmt w:val="none"/>
+      <w:suff w:val="nothing"/>
+      <w:lvlText w:val=""/>
+      <w:lvlJc w:val="left"/>
+      <w:pPr>
+        <w:ind w:left="0" w:hanging="0"/>
+      </w:pPr>
+    </w:lvl>
+    <w:lvl w:ilvl="6">
+      <w:start w:val="1"/>
+      <w:numFmt w:val="none"/>
+      <w:suff w:val="nothing"/>
+      <w:lvlText w:val=""/>
+      <w:lvlJc w:val="left"/>
+      <w:pPr>
+        <w:ind w:left="0" w:hanging="0"/>
+      </w:pPr>
+    </w:lvl>
+    <w:lvl w:ilvl="7">
+      <w:start w:val="1"/>
+      <w:numFmt w:val="none"/>
+      <w:suff w:val="nothing"/>
+      <w:lvlText w:val=""/>
+      <w:lvlJc w:val="left"/>
+      <w:pPr>
+        <w:ind w:left="0" w:hanging="0"/>
+      </w:pPr>
+    </w:lvl>
+    <w:lvl w:ilvl="8">
+      <w:start w:val="1"/>
+      <w:numFmt w:val="none"/>
+      <w:suff w:val="nothing"/>
+      <w:lvlText w:val=""/>
+      <w:lvlJc w:val="left"/>
+      <w:pPr>
+        <w:ind w:left="0" w:hanging="0"/>
+      </w:pPr>
+    </w:lvl>
+  </w:abstractNum>
+  <w:abstractNum w:abstractNumId="2">
+    <w:lvl w:ilvl="0">
+      <w:start w:val="1"/>
+      <w:numFmt w:val="none"/>
+      <w:suff w:val="nothing"/>
+      <w:lvlText w:val=""/>
+      <w:lvlJc w:val="left"/>
+      <w:pPr>
+        <w:ind w:left="0" w:hanging="0"/>
+      </w:pPr>
+    </w:lvl>
+    <w:lvl w:ilvl="1">
+      <w:start w:val="1"/>
+      <w:numFmt w:val="none"/>
+      <w:suff w:val="nothing"/>
+      <w:lvlText w:val=""/>
+      <w:lvlJc w:val="left"/>
+      <w:pPr>
+        <w:ind w:left="0" w:hanging="0"/>
+      </w:pPr>
+    </w:lvl>
+    <w:lvl w:ilvl="2">
+      <w:start w:val="1"/>
+      <w:numFmt w:val="none"/>
+      <w:suff w:val="nothing"/>
+      <w:lvlText w:val=""/>
+      <w:lvlJc w:val="left"/>
+      <w:pPr>
+        <w:ind w:left="0" w:hanging="0"/>
+      </w:pPr>
+    </w:lvl>
+    <w:lvl w:ilvl="3">
+      <w:start w:val="1"/>
+      <w:numFmt w:val="none"/>
+      <w:suff w:val="nothing"/>
+      <w:lvlText w:val=""/>
+      <w:lvlJc w:val="left"/>
+      <w:pPr>
+        <w:ind w:left="0" w:hanging="0"/>
+      </w:pPr>
+    </w:lvl>
+    <w:lvl w:ilvl="4">
+      <w:start w:val="1"/>
+      <w:numFmt w:val="none"/>
+      <w:suff w:val="nothing"/>
+      <w:lvlText w:val=""/>
+      <w:lvlJc w:val="left"/>
+      <w:pPr>
+        <w:ind w:left="0" w:hanging="0"/>
+      </w:pPr>
+    </w:lvl>
+    <w:lvl w:ilvl="5">
+      <w:start w:val="1"/>
+      <w:numFmt w:val="none"/>
+      <w:suff w:val="nothing"/>
+      <w:lvlText w:val=""/>
+      <w:lvlJc w:val="left"/>
+      <w:pPr>
+        <w:ind w:left="0" w:hanging="0"/>
+      </w:pPr>
+    </w:lvl>
+    <w:lvl w:ilvl="6">
+      <w:start w:val="1"/>
+      <w:numFmt w:val="none"/>
+      <w:suff w:val="nothing"/>
+      <w:lvlText w:val=""/>
+      <w:lvlJc w:val="left"/>
+      <w:pPr>
+        <w:ind w:left="0" w:hanging="0"/>
+      </w:pPr>
+    </w:lvl>
+    <w:lvl w:ilvl="7">
+      <w:start w:val="1"/>
+      <w:numFmt w:val="none"/>
+      <w:suff w:val="nothing"/>
+      <w:lvlText w:val=""/>
+      <w:lvlJc w:val="left"/>
+      <w:pPr>
+        <w:ind w:left="0" w:hanging="0"/>
+      </w:pPr>
+    </w:lvl>
+    <w:lvl w:ilvl="8">
+      <w:start w:val="1"/>
+      <w:numFmt w:val="none"/>
+      <w:suff w:val="nothing"/>
+      <w:lvlText w:val=""/>
+      <w:lvlJc w:val="left"/>
+      <w:pPr>
+        <w:ind w:left="0" w:hanging="0"/>
+      </w:pPr>
+    </w:lvl>
+  </w:abstractNum>
+  <w:num w:numId="1">
+    <w:abstractNumId w:val="1"/>
+  </w:num>
+  <w:num w:numId="2">
+    <w:abstractNumId w:val="2"/>
+  </w:num>
+</w:numbering>
 </file>
 
 <file path=word/styles.xml><?xml version="1.0" encoding="utf-8"?>
@@ -2604,6 +2099,44 @@
       <w:lang w:val="fr-FR" w:eastAsia="en-US" w:bidi="ar-SA"/>
     </w:rPr>
   </w:style>
+  <w:style w:type="paragraph" w:styleId="Titre2">
+    <w:name w:val="Heading 2"/>
+    <w:basedOn w:val="Titre"/>
+    <w:qFormat/>
+    <w:pPr>
+      <w:numPr>
+        <w:ilvl w:val="1"/>
+        <w:numId w:val="1"/>
+      </w:numPr>
+      <w:spacing w:before="200" w:after="120"/>
+      <w:outlineLvl w:val="1"/>
+    </w:pPr>
+    <w:rPr>
+      <w:b/>
+      <w:bCs/>
+      <w:sz w:val="32"/>
+      <w:szCs w:val="32"/>
+    </w:rPr>
+  </w:style>
+  <w:style w:type="paragraph" w:styleId="Titre3">
+    <w:name w:val="Heading 3"/>
+    <w:basedOn w:val="Titre"/>
+    <w:qFormat/>
+    <w:pPr>
+      <w:numPr>
+        <w:ilvl w:val="2"/>
+        <w:numId w:val="1"/>
+      </w:numPr>
+      <w:spacing w:before="140" w:after="120"/>
+      <w:outlineLvl w:val="2"/>
+    </w:pPr>
+    <w:rPr>
+      <w:b/>
+      <w:bCs/>
+      <w:sz w:val="28"/>
+      <w:szCs w:val="28"/>
+    </w:rPr>
+  </w:style>
   <w:style w:type="character" w:styleId="DefaultParagraphFont" w:default="1">
     <w:name w:val="Default Paragraph Font"/>
     <w:uiPriority w:val="1"/>

</xml_diff>